<commit_message>
r_x, r_y, r_z y sus tests hechos
</commit_message>
<xml_diff>
--- a/Seguimiento.docx
+++ b/Seguimiento.docx
@@ -172,6 +172,7 @@
         <w:rPr>
           <w:rFonts w:ascii="Arial" w:hAnsi="Arial"/>
           <w:color w:val="FF0000"/>
+          <w:highlight w:val="yellow"/>
         </w:rPr>
       </w:pPr>
       <w:proofErr w:type="spellStart"/>
@@ -180,6 +181,7 @@
           <w:rStyle w:val="normaltextrun"/>
           <w:rFonts w:ascii="Arial" w:hAnsi="Arial"/>
           <w:color w:val="FF0000"/>
+          <w:highlight w:val="yellow"/>
         </w:rPr>
         <w:t>angl.m</w:t>
       </w:r>
@@ -189,6 +191,7 @@
           <w:rStyle w:val="eop"/>
           <w:rFonts w:ascii="Arial" w:hAnsi="Arial"/>
           <w:color w:val="FF0000"/>
+          <w:highlight w:val="yellow"/>
         </w:rPr>
         <w:t> </w:t>
       </w:r>
@@ -204,6 +207,7 @@
         <w:textAlignment w:val="baseline"/>
         <w:rPr>
           <w:rFonts w:ascii="Arial" w:hAnsi="Arial"/>
+          <w:highlight w:val="yellow"/>
         </w:rPr>
       </w:pPr>
       <w:proofErr w:type="spellStart"/>
@@ -211,6 +215,7 @@
         <w:rPr>
           <w:rStyle w:val="normaltextrun"/>
           <w:rFonts w:ascii="Arial" w:hAnsi="Arial"/>
+          <w:highlight w:val="yellow"/>
         </w:rPr>
         <w:t>anglesdr.m</w:t>
       </w:r>
@@ -219,6 +224,7 @@
         <w:rPr>
           <w:rStyle w:val="eop"/>
           <w:rFonts w:ascii="Arial" w:hAnsi="Arial"/>
+          <w:highlight w:val="yellow"/>
         </w:rPr>
         <w:t> </w:t>
       </w:r>
@@ -234,6 +240,7 @@
         <w:textAlignment w:val="baseline"/>
         <w:rPr>
           <w:rFonts w:ascii="Arial" w:hAnsi="Arial"/>
+          <w:highlight w:val="yellow"/>
         </w:rPr>
       </w:pPr>
       <w:proofErr w:type="spellStart"/>
@@ -241,6 +248,7 @@
         <w:rPr>
           <w:rStyle w:val="normaltextrun"/>
           <w:rFonts w:ascii="Arial" w:hAnsi="Arial"/>
+          <w:highlight w:val="yellow"/>
         </w:rPr>
         <w:t>anglesg.m</w:t>
       </w:r>
@@ -249,6 +257,7 @@
         <w:rPr>
           <w:rStyle w:val="eop"/>
           <w:rFonts w:ascii="Arial" w:hAnsi="Arial"/>
+          <w:highlight w:val="yellow"/>
         </w:rPr>
         <w:t> </w:t>
       </w:r>
@@ -297,12 +306,14 @@
         <w:textAlignment w:val="baseline"/>
         <w:rPr>
           <w:rFonts w:ascii="Arial" w:hAnsi="Arial"/>
+          <w:color w:val="FF0000"/>
         </w:rPr>
       </w:pPr>
       <w:r>
         <w:rPr>
           <w:rStyle w:val="normaltextrun"/>
           <w:rFonts w:ascii="Arial" w:hAnsi="Arial"/>
+          <w:color w:val="FF0000"/>
         </w:rPr>
         <w:t>Cheb3D.m</w:t>
       </w:r>
@@ -310,6 +321,7 @@
         <w:rPr>
           <w:rStyle w:val="eop"/>
           <w:rFonts w:ascii="Arial" w:hAnsi="Arial"/>
+          <w:color w:val="FF0000"/>
         </w:rPr>
         <w:t> </w:t>
       </w:r>
@@ -355,6 +367,7 @@
         <w:textAlignment w:val="baseline"/>
         <w:rPr>
           <w:rFonts w:ascii="Arial" w:hAnsi="Arial"/>
+          <w:highlight w:val="yellow"/>
         </w:rPr>
       </w:pPr>
       <w:proofErr w:type="spellStart"/>
@@ -362,6 +375,7 @@
         <w:rPr>
           <w:rStyle w:val="normaltextrun"/>
           <w:rFonts w:ascii="Arial" w:hAnsi="Arial"/>
+          <w:highlight w:val="yellow"/>
         </w:rPr>
         <w:t>doubler.m</w:t>
       </w:r>
@@ -370,6 +384,7 @@
         <w:rPr>
           <w:rStyle w:val="eop"/>
           <w:rFonts w:ascii="Arial" w:hAnsi="Arial"/>
+          <w:highlight w:val="yellow"/>
         </w:rPr>
         <w:t> </w:t>
       </w:r>
@@ -626,6 +641,7 @@
         <w:textAlignment w:val="baseline"/>
         <w:rPr>
           <w:rFonts w:ascii="Arial" w:hAnsi="Arial"/>
+          <w:highlight w:val="yellow"/>
         </w:rPr>
       </w:pPr>
       <w:proofErr w:type="spellStart"/>
@@ -633,6 +649,7 @@
         <w:rPr>
           <w:rStyle w:val="normaltextrun"/>
           <w:rFonts w:ascii="Arial" w:hAnsi="Arial"/>
+          <w:highlight w:val="yellow"/>
         </w:rPr>
         <w:t>gibbs.m</w:t>
       </w:r>
@@ -641,6 +658,7 @@
         <w:rPr>
           <w:rStyle w:val="eop"/>
           <w:rFonts w:ascii="Arial" w:hAnsi="Arial"/>
+          <w:highlight w:val="yellow"/>
         </w:rPr>
         <w:t> </w:t>
       </w:r>
@@ -716,6 +734,7 @@
         <w:textAlignment w:val="baseline"/>
         <w:rPr>
           <w:rFonts w:ascii="Arial" w:hAnsi="Arial"/>
+          <w:highlight w:val="yellow"/>
         </w:rPr>
       </w:pPr>
       <w:proofErr w:type="spellStart"/>
@@ -723,6 +742,7 @@
         <w:rPr>
           <w:rStyle w:val="normaltextrun"/>
           <w:rFonts w:ascii="Arial" w:hAnsi="Arial"/>
+          <w:highlight w:val="yellow"/>
         </w:rPr>
         <w:t>hgibbs.m</w:t>
       </w:r>
@@ -731,6 +751,7 @@
         <w:rPr>
           <w:rStyle w:val="eop"/>
           <w:rFonts w:ascii="Arial" w:hAnsi="Arial"/>
+          <w:highlight w:val="yellow"/>
         </w:rPr>
         <w:t> </w:t>
       </w:r>
@@ -937,6 +958,7 @@
         <w:rPr>
           <w:rFonts w:ascii="Arial" w:hAnsi="Arial"/>
           <w:color w:val="FF0000"/>
+          <w:highlight w:val="green"/>
         </w:rPr>
       </w:pPr>
       <w:proofErr w:type="spellStart"/>
@@ -945,6 +967,7 @@
           <w:rStyle w:val="normaltextrun"/>
           <w:rFonts w:ascii="Arial" w:hAnsi="Arial"/>
           <w:color w:val="FF0000"/>
+          <w:highlight w:val="green"/>
         </w:rPr>
         <w:t>Mjday.m</w:t>
       </w:r>
@@ -954,6 +977,7 @@
           <w:rStyle w:val="eop"/>
           <w:rFonts w:ascii="Arial" w:hAnsi="Arial"/>
           <w:color w:val="FF0000"/>
+          <w:highlight w:val="green"/>
         </w:rPr>
         <w:t> </w:t>
       </w:r>
@@ -1560,11 +1584,3462 @@
     </w:p>
     <w:p>
       <w:pPr>
+        <w:pStyle w:val="paragraph"/>
+        <w:spacing w:before="0" w:beforeAutospacing="0" w:after="160" w:afterAutospacing="0"/>
+        <w:textAlignment w:val="baseline"/>
+        <w:rPr>
+          <w:rStyle w:val="eop"/>
+          <w:rFonts w:ascii="Arial" w:hAnsi="Arial"/>
+        </w:rPr>
+      </w:pPr>
+      <w:r>
+        <w:rPr>
+          <w:rStyle w:val="eop"/>
+          <w:rFonts w:ascii="Arial" w:hAnsi="Arial"/>
+        </w:rPr>
+        <w:t xml:space="preserve">Funciones </w:t>
+      </w:r>
+      <w:r>
+        <w:rPr>
+          <w:rStyle w:val="eop"/>
+          <w:rFonts w:ascii="Arial" w:hAnsi="Arial"/>
+          <w:highlight w:val="yellow"/>
+        </w:rPr>
+        <w:t>subrayadas en amarillo</w:t>
+      </w:r>
+      <w:r>
+        <w:rPr>
+          <w:rStyle w:val="eop"/>
+          <w:rFonts w:ascii="Arial" w:hAnsi="Arial"/>
+        </w:rPr>
+        <w:t xml:space="preserve"> no hay que implementar en primera iteración.</w:t>
+      </w:r>
+    </w:p>
+    <w:p>
+      <w:pPr>
+        <w:pStyle w:val="paragraph"/>
+        <w:spacing w:before="0" w:beforeAutospacing="0" w:after="160" w:afterAutospacing="0"/>
+        <w:textAlignment w:val="baseline"/>
+        <w:rPr>
+          <w:rStyle w:val="eop"/>
+          <w:rFonts w:ascii="Arial" w:hAnsi="Arial"/>
+        </w:rPr>
+      </w:pPr>
+      <w:r>
+        <w:rPr>
+          <w:rStyle w:val="eop"/>
+          <w:rFonts w:ascii="Arial" w:hAnsi="Arial"/>
+        </w:rPr>
+        <w:t xml:space="preserve">Funciones </w:t>
+      </w:r>
+      <w:r>
+        <w:rPr>
+          <w:rStyle w:val="eop"/>
+          <w:rFonts w:ascii="Arial" w:hAnsi="Arial"/>
+          <w:highlight w:val="green"/>
+        </w:rPr>
+        <w:t>subrayadas en verde</w:t>
+      </w:r>
+      <w:r>
+        <w:rPr>
+          <w:rStyle w:val="eop"/>
+          <w:rFonts w:ascii="Arial" w:hAnsi="Arial"/>
+        </w:rPr>
+        <w:t xml:space="preserve"> están implementadas.</w:t>
+      </w:r>
+    </w:p>
+    <w:p>
+      <w:pPr>
         <w:kinsoku w:val="0"/>
         <w:overflowPunct w:val="0"/>
         <w:rPr>
+          <w:color w:val="FF0000"/>
+          <w:sz w:val="32"/>
+          <w:szCs w:val="32"/>
+        </w:rPr>
+      </w:pPr>
+      <w:proofErr w:type="spellStart"/>
+      <w:r>
+        <w:rPr>
+          <w:color w:val="FF0000"/>
+          <w:sz w:val="32"/>
+          <w:szCs w:val="32"/>
+        </w:rPr>
+        <w:t>Mjday</w:t>
+      </w:r>
+      <w:proofErr w:type="spellEnd"/>
+      <w:r>
+        <w:rPr>
+          <w:color w:val="FF0000"/>
+          <w:sz w:val="32"/>
+          <w:szCs w:val="32"/>
+        </w:rPr>
+        <w:t>:</w:t>
+      </w:r>
+    </w:p>
+    <w:p>
+      <w:pPr>
+        <w:kinsoku w:val="0"/>
+        <w:overflowPunct w:val="0"/>
+        <w:rPr>
+          <w:sz w:val="24"/>
+          <w:szCs w:val="24"/>
+        </w:rPr>
+      </w:pPr>
+      <w:proofErr w:type="spellStart"/>
+      <w:r>
+        <w:rPr>
+          <w:sz w:val="24"/>
+          <w:szCs w:val="24"/>
+        </w:rPr>
+        <w:t>Tests</w:t>
+      </w:r>
+      <w:proofErr w:type="spellEnd"/>
+      <w:r>
+        <w:rPr>
+          <w:sz w:val="24"/>
+          <w:szCs w:val="24"/>
+        </w:rPr>
+        <w:t xml:space="preserve"> unitarios creados:</w:t>
+      </w:r>
+    </w:p>
+    <w:p>
+      <w:pPr>
+        <w:pStyle w:val="HTMLconformatoprevio"/>
+        <w:shd w:val="clear" w:color="auto" w:fill="1E1F22"/>
+        <w:rPr>
+          <w:color w:val="BCBEC4"/>
+        </w:rPr>
+      </w:pPr>
+      <w:proofErr w:type="spellStart"/>
+      <w:r>
+        <w:rPr>
+          <w:color w:val="CF8E6D"/>
+        </w:rPr>
+        <w:t>int</w:t>
+      </w:r>
+      <w:proofErr w:type="spellEnd"/>
+      <w:r>
+        <w:rPr>
+          <w:color w:val="CF8E6D"/>
+        </w:rPr>
+        <w:t xml:space="preserve"> </w:t>
+      </w:r>
+      <w:r>
+        <w:rPr>
+          <w:color w:val="56A8F5"/>
+        </w:rPr>
+        <w:t>Mjday_01</w:t>
+      </w:r>
+      <w:proofErr w:type="gramStart"/>
+      <w:r>
+        <w:rPr>
+          <w:color w:val="BCBEC4"/>
+        </w:rPr>
+        <w:t>(){</w:t>
+      </w:r>
+      <w:proofErr w:type="gramEnd"/>
+      <w:r>
+        <w:rPr>
+          <w:color w:val="BCBEC4"/>
+        </w:rPr>
+        <w:br/>
+      </w:r>
+      <w:r>
+        <w:rPr>
+          <w:color w:val="BCBEC4"/>
+        </w:rPr>
+        <w:br/>
+        <w:t xml:space="preserve">    </w:t>
+      </w:r>
+      <w:r>
+        <w:rPr>
+          <w:color w:val="908B25"/>
+        </w:rPr>
+        <w:t>_</w:t>
+      </w:r>
+      <w:proofErr w:type="spellStart"/>
+      <w:r>
+        <w:rPr>
+          <w:color w:val="908B25"/>
+        </w:rPr>
+        <w:t>assert</w:t>
+      </w:r>
+      <w:proofErr w:type="spellEnd"/>
+      <w:r>
+        <w:rPr>
+          <w:color w:val="BCBEC4"/>
+        </w:rPr>
+        <w:t>(</w:t>
+      </w:r>
+      <w:proofErr w:type="spellStart"/>
+      <w:r>
+        <w:rPr>
+          <w:color w:val="BCBEC4"/>
+        </w:rPr>
+        <w:t>fabs</w:t>
+      </w:r>
+      <w:proofErr w:type="spellEnd"/>
+      <w:r>
+        <w:rPr>
+          <w:color w:val="BCBEC4"/>
+        </w:rPr>
+        <w:t>(</w:t>
+      </w:r>
+      <w:proofErr w:type="spellStart"/>
+      <w:r>
+        <w:rPr>
+          <w:color w:val="BCBEC4"/>
+        </w:rPr>
+        <w:t>Mjday</w:t>
+      </w:r>
+      <w:proofErr w:type="spellEnd"/>
+      <w:r>
+        <w:rPr>
+          <w:color w:val="BCBEC4"/>
+        </w:rPr>
+        <w:t>(</w:t>
+      </w:r>
+      <w:r>
+        <w:rPr>
+          <w:color w:val="2AACB8"/>
+        </w:rPr>
+        <w:t>2025</w:t>
+      </w:r>
+      <w:r>
+        <w:rPr>
+          <w:color w:val="BCBEC4"/>
+        </w:rPr>
+        <w:t xml:space="preserve">, </w:t>
+      </w:r>
+      <w:r>
+        <w:rPr>
+          <w:color w:val="2AACB8"/>
+        </w:rPr>
+        <w:t>4</w:t>
+      </w:r>
+      <w:r>
+        <w:rPr>
+          <w:color w:val="BCBEC4"/>
+        </w:rPr>
+        <w:t xml:space="preserve">, </w:t>
+      </w:r>
+      <w:r>
+        <w:rPr>
+          <w:color w:val="2AACB8"/>
+        </w:rPr>
+        <w:t>3</w:t>
+      </w:r>
+      <w:r>
+        <w:rPr>
+          <w:color w:val="BCBEC4"/>
+        </w:rPr>
+        <w:t xml:space="preserve">, </w:t>
+      </w:r>
+      <w:r>
+        <w:rPr>
+          <w:color w:val="2AACB8"/>
+        </w:rPr>
+        <w:t>0</w:t>
+      </w:r>
+      <w:r>
+        <w:rPr>
+          <w:color w:val="BCBEC4"/>
+        </w:rPr>
+        <w:t xml:space="preserve">, </w:t>
+      </w:r>
+      <w:r>
+        <w:rPr>
+          <w:color w:val="2AACB8"/>
+        </w:rPr>
+        <w:t>0</w:t>
+      </w:r>
+      <w:r>
+        <w:rPr>
+          <w:color w:val="BCBEC4"/>
+        </w:rPr>
+        <w:t xml:space="preserve">, </w:t>
+      </w:r>
+      <w:r>
+        <w:rPr>
+          <w:color w:val="2AACB8"/>
+        </w:rPr>
+        <w:t>0.0</w:t>
+      </w:r>
+      <w:r>
+        <w:rPr>
+          <w:color w:val="BCBEC4"/>
+        </w:rPr>
+        <w:t xml:space="preserve">) - </w:t>
+      </w:r>
+      <w:proofErr w:type="spellStart"/>
+      <w:r>
+        <w:rPr>
+          <w:color w:val="BCBEC4"/>
+        </w:rPr>
+        <w:t>Mjday</w:t>
+      </w:r>
+      <w:proofErr w:type="spellEnd"/>
+      <w:r>
+        <w:rPr>
+          <w:color w:val="BCBEC4"/>
+        </w:rPr>
+        <w:t>(</w:t>
+      </w:r>
+      <w:r>
+        <w:rPr>
+          <w:color w:val="2AACB8"/>
+        </w:rPr>
+        <w:t>2025</w:t>
+      </w:r>
+      <w:r>
+        <w:rPr>
+          <w:color w:val="BCBEC4"/>
+        </w:rPr>
+        <w:t xml:space="preserve">, </w:t>
+      </w:r>
+      <w:r>
+        <w:rPr>
+          <w:color w:val="2AACB8"/>
+        </w:rPr>
+        <w:t>4</w:t>
+      </w:r>
+      <w:r>
+        <w:rPr>
+          <w:color w:val="BCBEC4"/>
+        </w:rPr>
+        <w:t xml:space="preserve">, </w:t>
+      </w:r>
+      <w:r>
+        <w:rPr>
+          <w:color w:val="2AACB8"/>
+        </w:rPr>
+        <w:t>3</w:t>
+      </w:r>
+      <w:r>
+        <w:rPr>
+          <w:color w:val="BCBEC4"/>
+        </w:rPr>
+        <w:t>)) &lt; TOL_);</w:t>
+      </w:r>
+      <w:r>
+        <w:rPr>
+          <w:color w:val="BCBEC4"/>
+        </w:rPr>
+        <w:br/>
+        <w:t xml:space="preserve">    </w:t>
+      </w:r>
+      <w:proofErr w:type="spellStart"/>
+      <w:r>
+        <w:rPr>
+          <w:color w:val="CF8E6D"/>
+        </w:rPr>
+        <w:t>return</w:t>
+      </w:r>
+      <w:proofErr w:type="spellEnd"/>
+      <w:r>
+        <w:rPr>
+          <w:color w:val="CF8E6D"/>
+        </w:rPr>
+        <w:t xml:space="preserve"> </w:t>
+      </w:r>
+      <w:r>
+        <w:rPr>
+          <w:color w:val="2AACB8"/>
+        </w:rPr>
+        <w:t>0</w:t>
+      </w:r>
+      <w:r>
+        <w:rPr>
+          <w:color w:val="BCBEC4"/>
+        </w:rPr>
+        <w:t>;</w:t>
+      </w:r>
+      <w:r>
+        <w:rPr>
+          <w:color w:val="BCBEC4"/>
+        </w:rPr>
+        <w:br/>
+        <w:t>}</w:t>
+      </w:r>
+    </w:p>
+    <w:p>
+      <w:pPr>
+        <w:shd w:val="clear" w:color="auto" w:fill="1E1F22"/>
+        <w:tabs>
+          <w:tab w:val="left" w:pos="916"/>
+          <w:tab w:val="left" w:pos="1832"/>
+          <w:tab w:val="left" w:pos="2748"/>
+          <w:tab w:val="left" w:pos="3664"/>
+          <w:tab w:val="left" w:pos="4580"/>
+          <w:tab w:val="left" w:pos="5496"/>
+          <w:tab w:val="left" w:pos="6412"/>
+          <w:tab w:val="left" w:pos="7328"/>
+          <w:tab w:val="left" w:pos="8244"/>
+          <w:tab w:val="left" w:pos="9160"/>
+          <w:tab w:val="left" w:pos="10076"/>
+          <w:tab w:val="left" w:pos="10992"/>
+          <w:tab w:val="left" w:pos="11908"/>
+          <w:tab w:val="left" w:pos="12824"/>
+          <w:tab w:val="left" w:pos="13740"/>
+          <w:tab w:val="left" w:pos="14656"/>
+        </w:tabs>
+        <w:spacing w:after="0" w:line="240" w:lineRule="auto"/>
+        <w:rPr>
+          <w:rFonts w:ascii="Courier New" w:eastAsia="Times New Roman" w:hAnsi="Courier New" w:cs="Courier New"/>
+          <w:color w:val="BCBEC4"/>
           <w:sz w:val="20"/>
           <w:szCs w:val="20"/>
+          <w:lang w:eastAsia="es-ES"/>
+        </w:rPr>
+      </w:pPr>
+      <w:proofErr w:type="spellStart"/>
+      <w:r>
+        <w:rPr>
+          <w:rFonts w:ascii="Courier New" w:eastAsia="Times New Roman" w:hAnsi="Courier New" w:cs="Courier New"/>
+          <w:color w:val="CF8E6D"/>
+          <w:sz w:val="20"/>
+          <w:szCs w:val="20"/>
+          <w:lang w:eastAsia="es-ES"/>
+        </w:rPr>
+        <w:t>int</w:t>
+      </w:r>
+      <w:proofErr w:type="spellEnd"/>
+      <w:r>
+        <w:rPr>
+          <w:rFonts w:ascii="Courier New" w:eastAsia="Times New Roman" w:hAnsi="Courier New" w:cs="Courier New"/>
+          <w:color w:val="CF8E6D"/>
+          <w:sz w:val="20"/>
+          <w:szCs w:val="20"/>
+          <w:lang w:eastAsia="es-ES"/>
+        </w:rPr>
+        <w:t xml:space="preserve"> </w:t>
+      </w:r>
+      <w:r>
+        <w:rPr>
+          <w:rFonts w:ascii="Courier New" w:eastAsia="Times New Roman" w:hAnsi="Courier New" w:cs="Courier New"/>
+          <w:color w:val="56A8F5"/>
+          <w:sz w:val="20"/>
+          <w:szCs w:val="20"/>
+          <w:lang w:eastAsia="es-ES"/>
+        </w:rPr>
+        <w:t>Mjday_02</w:t>
+      </w:r>
+      <w:proofErr w:type="gramStart"/>
+      <w:r>
+        <w:rPr>
+          <w:rFonts w:ascii="Courier New" w:eastAsia="Times New Roman" w:hAnsi="Courier New" w:cs="Courier New"/>
+          <w:color w:val="BCBEC4"/>
+          <w:sz w:val="20"/>
+          <w:szCs w:val="20"/>
+          <w:lang w:eastAsia="es-ES"/>
+        </w:rPr>
+        <w:t>(){</w:t>
+      </w:r>
+      <w:proofErr w:type="gramEnd"/>
+      <w:r>
+        <w:rPr>
+          <w:rFonts w:ascii="Courier New" w:eastAsia="Times New Roman" w:hAnsi="Courier New" w:cs="Courier New"/>
+          <w:color w:val="BCBEC4"/>
+          <w:sz w:val="20"/>
+          <w:szCs w:val="20"/>
+          <w:lang w:eastAsia="es-ES"/>
+        </w:rPr>
+        <w:br/>
+        <w:t xml:space="preserve">    </w:t>
+      </w:r>
+      <w:proofErr w:type="spellStart"/>
+      <w:r>
+        <w:rPr>
+          <w:rFonts w:ascii="Courier New" w:eastAsia="Times New Roman" w:hAnsi="Courier New" w:cs="Courier New"/>
+          <w:color w:val="CF8E6D"/>
+          <w:sz w:val="20"/>
+          <w:szCs w:val="20"/>
+          <w:lang w:eastAsia="es-ES"/>
+        </w:rPr>
+        <w:t>double</w:t>
+      </w:r>
+      <w:proofErr w:type="spellEnd"/>
+      <w:r>
+        <w:rPr>
+          <w:rFonts w:ascii="Courier New" w:eastAsia="Times New Roman" w:hAnsi="Courier New" w:cs="Courier New"/>
+          <w:color w:val="CF8E6D"/>
+          <w:sz w:val="20"/>
+          <w:szCs w:val="20"/>
+          <w:lang w:eastAsia="es-ES"/>
+        </w:rPr>
+        <w:t xml:space="preserve"> </w:t>
+      </w:r>
+      <w:r>
+        <w:rPr>
+          <w:rFonts w:ascii="Courier New" w:eastAsia="Times New Roman" w:hAnsi="Courier New" w:cs="Courier New"/>
+          <w:color w:val="BCBEC4"/>
+          <w:sz w:val="20"/>
+          <w:szCs w:val="20"/>
+          <w:lang w:eastAsia="es-ES"/>
+        </w:rPr>
+        <w:t xml:space="preserve">x = </w:t>
+      </w:r>
+      <w:proofErr w:type="spellStart"/>
+      <w:r>
+        <w:rPr>
+          <w:rFonts w:ascii="Courier New" w:eastAsia="Times New Roman" w:hAnsi="Courier New" w:cs="Courier New"/>
+          <w:color w:val="BCBEC4"/>
+          <w:sz w:val="20"/>
+          <w:szCs w:val="20"/>
+          <w:lang w:eastAsia="es-ES"/>
+        </w:rPr>
+        <w:t>Mjday</w:t>
+      </w:r>
+      <w:proofErr w:type="spellEnd"/>
+      <w:r>
+        <w:rPr>
+          <w:rFonts w:ascii="Courier New" w:eastAsia="Times New Roman" w:hAnsi="Courier New" w:cs="Courier New"/>
+          <w:color w:val="BCBEC4"/>
+          <w:sz w:val="20"/>
+          <w:szCs w:val="20"/>
+          <w:lang w:eastAsia="es-ES"/>
+        </w:rPr>
+        <w:t>(</w:t>
+      </w:r>
+      <w:r>
+        <w:rPr>
+          <w:rFonts w:ascii="Courier New" w:eastAsia="Times New Roman" w:hAnsi="Courier New" w:cs="Courier New"/>
+          <w:color w:val="2AACB8"/>
+          <w:sz w:val="20"/>
+          <w:szCs w:val="20"/>
+          <w:lang w:eastAsia="es-ES"/>
+        </w:rPr>
+        <w:t>2025</w:t>
+      </w:r>
+      <w:r>
+        <w:rPr>
+          <w:rFonts w:ascii="Courier New" w:eastAsia="Times New Roman" w:hAnsi="Courier New" w:cs="Courier New"/>
+          <w:color w:val="BCBEC4"/>
+          <w:sz w:val="20"/>
+          <w:szCs w:val="20"/>
+          <w:lang w:eastAsia="es-ES"/>
+        </w:rPr>
+        <w:t>,</w:t>
+      </w:r>
+      <w:r>
+        <w:rPr>
+          <w:rFonts w:ascii="Courier New" w:eastAsia="Times New Roman" w:hAnsi="Courier New" w:cs="Courier New"/>
+          <w:color w:val="2AACB8"/>
+          <w:sz w:val="20"/>
+          <w:szCs w:val="20"/>
+          <w:lang w:eastAsia="es-ES"/>
+        </w:rPr>
+        <w:t>4</w:t>
+      </w:r>
+      <w:r>
+        <w:rPr>
+          <w:rFonts w:ascii="Courier New" w:eastAsia="Times New Roman" w:hAnsi="Courier New" w:cs="Courier New"/>
+          <w:color w:val="BCBEC4"/>
+          <w:sz w:val="20"/>
+          <w:szCs w:val="20"/>
+          <w:lang w:eastAsia="es-ES"/>
+        </w:rPr>
+        <w:t>,</w:t>
+      </w:r>
+      <w:r>
+        <w:rPr>
+          <w:rFonts w:ascii="Courier New" w:eastAsia="Times New Roman" w:hAnsi="Courier New" w:cs="Courier New"/>
+          <w:color w:val="2AACB8"/>
+          <w:sz w:val="20"/>
+          <w:szCs w:val="20"/>
+          <w:lang w:eastAsia="es-ES"/>
+        </w:rPr>
+        <w:t>12</w:t>
+      </w:r>
+      <w:r>
+        <w:rPr>
+          <w:rFonts w:ascii="Courier New" w:eastAsia="Times New Roman" w:hAnsi="Courier New" w:cs="Courier New"/>
+          <w:color w:val="BCBEC4"/>
+          <w:sz w:val="20"/>
+          <w:szCs w:val="20"/>
+          <w:lang w:eastAsia="es-ES"/>
+        </w:rPr>
+        <w:t>,</w:t>
+      </w:r>
+      <w:r>
+        <w:rPr>
+          <w:rFonts w:ascii="Courier New" w:eastAsia="Times New Roman" w:hAnsi="Courier New" w:cs="Courier New"/>
+          <w:color w:val="2AACB8"/>
+          <w:sz w:val="20"/>
+          <w:szCs w:val="20"/>
+          <w:lang w:eastAsia="es-ES"/>
+        </w:rPr>
+        <w:t>1</w:t>
+      </w:r>
+      <w:r>
+        <w:rPr>
+          <w:rFonts w:ascii="Courier New" w:eastAsia="Times New Roman" w:hAnsi="Courier New" w:cs="Courier New"/>
+          <w:color w:val="BCBEC4"/>
+          <w:sz w:val="20"/>
+          <w:szCs w:val="20"/>
+          <w:lang w:eastAsia="es-ES"/>
+        </w:rPr>
+        <w:t>,</w:t>
+      </w:r>
+      <w:r>
+        <w:rPr>
+          <w:rFonts w:ascii="Courier New" w:eastAsia="Times New Roman" w:hAnsi="Courier New" w:cs="Courier New"/>
+          <w:color w:val="2AACB8"/>
+          <w:sz w:val="20"/>
+          <w:szCs w:val="20"/>
+          <w:lang w:eastAsia="es-ES"/>
+        </w:rPr>
+        <w:t>1</w:t>
+      </w:r>
+      <w:r>
+        <w:rPr>
+          <w:rFonts w:ascii="Courier New" w:eastAsia="Times New Roman" w:hAnsi="Courier New" w:cs="Courier New"/>
+          <w:color w:val="BCBEC4"/>
+          <w:sz w:val="20"/>
+          <w:szCs w:val="20"/>
+          <w:lang w:eastAsia="es-ES"/>
+        </w:rPr>
+        <w:t>,</w:t>
+      </w:r>
+      <w:r>
+        <w:rPr>
+          <w:rFonts w:ascii="Courier New" w:eastAsia="Times New Roman" w:hAnsi="Courier New" w:cs="Courier New"/>
+          <w:color w:val="2AACB8"/>
+          <w:sz w:val="20"/>
+          <w:szCs w:val="20"/>
+          <w:lang w:eastAsia="es-ES"/>
+        </w:rPr>
+        <w:t>1</w:t>
+      </w:r>
+      <w:r>
+        <w:rPr>
+          <w:rFonts w:ascii="Courier New" w:eastAsia="Times New Roman" w:hAnsi="Courier New" w:cs="Courier New"/>
+          <w:color w:val="BCBEC4"/>
+          <w:sz w:val="20"/>
+          <w:szCs w:val="20"/>
+          <w:lang w:eastAsia="es-ES"/>
+        </w:rPr>
+        <w:t>);</w:t>
+      </w:r>
+      <w:r>
+        <w:rPr>
+          <w:rFonts w:ascii="Courier New" w:eastAsia="Times New Roman" w:hAnsi="Courier New" w:cs="Courier New"/>
+          <w:color w:val="BCBEC4"/>
+          <w:sz w:val="20"/>
+          <w:szCs w:val="20"/>
+          <w:lang w:eastAsia="es-ES"/>
+        </w:rPr>
+        <w:br/>
+        <w:t xml:space="preserve">    </w:t>
+      </w:r>
+      <w:r>
+        <w:rPr>
+          <w:rFonts w:ascii="Courier New" w:eastAsia="Times New Roman" w:hAnsi="Courier New" w:cs="Courier New"/>
+          <w:color w:val="908B25"/>
+          <w:sz w:val="20"/>
+          <w:szCs w:val="20"/>
+          <w:lang w:eastAsia="es-ES"/>
+        </w:rPr>
+        <w:t>_</w:t>
+      </w:r>
+      <w:proofErr w:type="spellStart"/>
+      <w:r>
+        <w:rPr>
+          <w:rFonts w:ascii="Courier New" w:eastAsia="Times New Roman" w:hAnsi="Courier New" w:cs="Courier New"/>
+          <w:color w:val="908B25"/>
+          <w:sz w:val="20"/>
+          <w:szCs w:val="20"/>
+          <w:lang w:eastAsia="es-ES"/>
+        </w:rPr>
+        <w:t>assert</w:t>
+      </w:r>
+      <w:proofErr w:type="spellEnd"/>
+      <w:r>
+        <w:rPr>
+          <w:rFonts w:ascii="Courier New" w:eastAsia="Times New Roman" w:hAnsi="Courier New" w:cs="Courier New"/>
+          <w:color w:val="BCBEC4"/>
+          <w:sz w:val="20"/>
+          <w:szCs w:val="20"/>
+          <w:lang w:eastAsia="es-ES"/>
+        </w:rPr>
+        <w:t>(</w:t>
+      </w:r>
+      <w:proofErr w:type="spellStart"/>
+      <w:r>
+        <w:rPr>
+          <w:rFonts w:ascii="Courier New" w:eastAsia="Times New Roman" w:hAnsi="Courier New" w:cs="Courier New"/>
+          <w:color w:val="BCBEC4"/>
+          <w:sz w:val="20"/>
+          <w:szCs w:val="20"/>
+          <w:lang w:eastAsia="es-ES"/>
+        </w:rPr>
+        <w:t>fabs</w:t>
+      </w:r>
+      <w:proofErr w:type="spellEnd"/>
+      <w:r>
+        <w:rPr>
+          <w:rFonts w:ascii="Courier New" w:eastAsia="Times New Roman" w:hAnsi="Courier New" w:cs="Courier New"/>
+          <w:color w:val="BCBEC4"/>
+          <w:sz w:val="20"/>
+          <w:szCs w:val="20"/>
+          <w:lang w:eastAsia="es-ES"/>
+        </w:rPr>
+        <w:t>(</w:t>
+      </w:r>
+      <w:proofErr w:type="spellStart"/>
+      <w:r>
+        <w:rPr>
+          <w:rFonts w:ascii="Courier New" w:eastAsia="Times New Roman" w:hAnsi="Courier New" w:cs="Courier New"/>
+          <w:color w:val="BCBEC4"/>
+          <w:sz w:val="20"/>
+          <w:szCs w:val="20"/>
+          <w:lang w:eastAsia="es-ES"/>
+        </w:rPr>
+        <w:t>Mjday</w:t>
+      </w:r>
+      <w:proofErr w:type="spellEnd"/>
+      <w:r>
+        <w:rPr>
+          <w:rFonts w:ascii="Courier New" w:eastAsia="Times New Roman" w:hAnsi="Courier New" w:cs="Courier New"/>
+          <w:color w:val="BCBEC4"/>
+          <w:sz w:val="20"/>
+          <w:szCs w:val="20"/>
+          <w:lang w:eastAsia="es-ES"/>
+        </w:rPr>
+        <w:t>(</w:t>
+      </w:r>
+      <w:r>
+        <w:rPr>
+          <w:rFonts w:ascii="Courier New" w:eastAsia="Times New Roman" w:hAnsi="Courier New" w:cs="Courier New"/>
+          <w:color w:val="2AACB8"/>
+          <w:sz w:val="20"/>
+          <w:szCs w:val="20"/>
+          <w:lang w:eastAsia="es-ES"/>
+        </w:rPr>
+        <w:t>2025</w:t>
+      </w:r>
+      <w:r>
+        <w:rPr>
+          <w:rFonts w:ascii="Courier New" w:eastAsia="Times New Roman" w:hAnsi="Courier New" w:cs="Courier New"/>
+          <w:color w:val="BCBEC4"/>
+          <w:sz w:val="20"/>
+          <w:szCs w:val="20"/>
+          <w:lang w:eastAsia="es-ES"/>
+        </w:rPr>
+        <w:t>,</w:t>
+      </w:r>
+      <w:r>
+        <w:rPr>
+          <w:rFonts w:ascii="Courier New" w:eastAsia="Times New Roman" w:hAnsi="Courier New" w:cs="Courier New"/>
+          <w:color w:val="2AACB8"/>
+          <w:sz w:val="20"/>
+          <w:szCs w:val="20"/>
+          <w:lang w:eastAsia="es-ES"/>
+        </w:rPr>
+        <w:t>4</w:t>
+      </w:r>
+      <w:r>
+        <w:rPr>
+          <w:rFonts w:ascii="Courier New" w:eastAsia="Times New Roman" w:hAnsi="Courier New" w:cs="Courier New"/>
+          <w:color w:val="BCBEC4"/>
+          <w:sz w:val="20"/>
+          <w:szCs w:val="20"/>
+          <w:lang w:eastAsia="es-ES"/>
+        </w:rPr>
+        <w:t>,</w:t>
+      </w:r>
+      <w:r>
+        <w:rPr>
+          <w:rFonts w:ascii="Courier New" w:eastAsia="Times New Roman" w:hAnsi="Courier New" w:cs="Courier New"/>
+          <w:color w:val="2AACB8"/>
+          <w:sz w:val="20"/>
+          <w:szCs w:val="20"/>
+          <w:lang w:eastAsia="es-ES"/>
+        </w:rPr>
+        <w:t>12</w:t>
+      </w:r>
+      <w:r>
+        <w:rPr>
+          <w:rFonts w:ascii="Courier New" w:eastAsia="Times New Roman" w:hAnsi="Courier New" w:cs="Courier New"/>
+          <w:color w:val="BCBEC4"/>
+          <w:sz w:val="20"/>
+          <w:szCs w:val="20"/>
+          <w:lang w:eastAsia="es-ES"/>
+        </w:rPr>
+        <w:t>,</w:t>
+      </w:r>
+      <w:r>
+        <w:rPr>
+          <w:rFonts w:ascii="Courier New" w:eastAsia="Times New Roman" w:hAnsi="Courier New" w:cs="Courier New"/>
+          <w:color w:val="2AACB8"/>
+          <w:sz w:val="20"/>
+          <w:szCs w:val="20"/>
+          <w:lang w:eastAsia="es-ES"/>
+        </w:rPr>
+        <w:t>1</w:t>
+      </w:r>
+      <w:r>
+        <w:rPr>
+          <w:rFonts w:ascii="Courier New" w:eastAsia="Times New Roman" w:hAnsi="Courier New" w:cs="Courier New"/>
+          <w:color w:val="BCBEC4"/>
+          <w:sz w:val="20"/>
+          <w:szCs w:val="20"/>
+          <w:lang w:eastAsia="es-ES"/>
+        </w:rPr>
+        <w:t>,</w:t>
+      </w:r>
+      <w:r>
+        <w:rPr>
+          <w:rFonts w:ascii="Courier New" w:eastAsia="Times New Roman" w:hAnsi="Courier New" w:cs="Courier New"/>
+          <w:color w:val="2AACB8"/>
+          <w:sz w:val="20"/>
+          <w:szCs w:val="20"/>
+          <w:lang w:eastAsia="es-ES"/>
+        </w:rPr>
+        <w:t>1</w:t>
+      </w:r>
+      <w:r>
+        <w:rPr>
+          <w:rFonts w:ascii="Courier New" w:eastAsia="Times New Roman" w:hAnsi="Courier New" w:cs="Courier New"/>
+          <w:color w:val="BCBEC4"/>
+          <w:sz w:val="20"/>
+          <w:szCs w:val="20"/>
+          <w:lang w:eastAsia="es-ES"/>
+        </w:rPr>
+        <w:t>,</w:t>
+      </w:r>
+      <w:r>
+        <w:rPr>
+          <w:rFonts w:ascii="Courier New" w:eastAsia="Times New Roman" w:hAnsi="Courier New" w:cs="Courier New"/>
+          <w:color w:val="2AACB8"/>
+          <w:sz w:val="20"/>
+          <w:szCs w:val="20"/>
+          <w:lang w:eastAsia="es-ES"/>
+        </w:rPr>
+        <w:t>1</w:t>
+      </w:r>
+      <w:r>
+        <w:rPr>
+          <w:rFonts w:ascii="Courier New" w:eastAsia="Times New Roman" w:hAnsi="Courier New" w:cs="Courier New"/>
+          <w:color w:val="BCBEC4"/>
+          <w:sz w:val="20"/>
+          <w:szCs w:val="20"/>
+          <w:lang w:eastAsia="es-ES"/>
+        </w:rPr>
+        <w:t>)-</w:t>
+      </w:r>
+      <w:r>
+        <w:rPr>
+          <w:rFonts w:ascii="Courier New" w:eastAsia="Times New Roman" w:hAnsi="Courier New" w:cs="Courier New"/>
+          <w:color w:val="2AACB8"/>
+          <w:sz w:val="20"/>
+          <w:szCs w:val="20"/>
+          <w:lang w:eastAsia="es-ES"/>
+        </w:rPr>
+        <w:t>60777.0423726854</w:t>
+      </w:r>
+      <w:r>
+        <w:rPr>
+          <w:rFonts w:ascii="Courier New" w:eastAsia="Times New Roman" w:hAnsi="Courier New" w:cs="Courier New"/>
+          <w:color w:val="BCBEC4"/>
+          <w:sz w:val="20"/>
+          <w:szCs w:val="20"/>
+          <w:lang w:eastAsia="es-ES"/>
+        </w:rPr>
+        <w:t>)&lt;TOL2_);</w:t>
+      </w:r>
+      <w:r>
+        <w:rPr>
+          <w:rFonts w:ascii="Courier New" w:eastAsia="Times New Roman" w:hAnsi="Courier New" w:cs="Courier New"/>
+          <w:color w:val="BCBEC4"/>
+          <w:sz w:val="20"/>
+          <w:szCs w:val="20"/>
+          <w:lang w:eastAsia="es-ES"/>
+        </w:rPr>
+        <w:br/>
+        <w:t xml:space="preserve">    </w:t>
+      </w:r>
+      <w:proofErr w:type="spellStart"/>
+      <w:r>
+        <w:rPr>
+          <w:rFonts w:ascii="Courier New" w:eastAsia="Times New Roman" w:hAnsi="Courier New" w:cs="Courier New"/>
+          <w:color w:val="CF8E6D"/>
+          <w:sz w:val="20"/>
+          <w:szCs w:val="20"/>
+          <w:lang w:eastAsia="es-ES"/>
+        </w:rPr>
+        <w:t>return</w:t>
+      </w:r>
+      <w:proofErr w:type="spellEnd"/>
+      <w:r>
+        <w:rPr>
+          <w:rFonts w:ascii="Courier New" w:eastAsia="Times New Roman" w:hAnsi="Courier New" w:cs="Courier New"/>
+          <w:color w:val="CF8E6D"/>
+          <w:sz w:val="20"/>
+          <w:szCs w:val="20"/>
+          <w:lang w:eastAsia="es-ES"/>
+        </w:rPr>
+        <w:t xml:space="preserve"> </w:t>
+      </w:r>
+      <w:r>
+        <w:rPr>
+          <w:rFonts w:ascii="Courier New" w:eastAsia="Times New Roman" w:hAnsi="Courier New" w:cs="Courier New"/>
+          <w:color w:val="2AACB8"/>
+          <w:sz w:val="20"/>
+          <w:szCs w:val="20"/>
+          <w:lang w:eastAsia="es-ES"/>
+        </w:rPr>
+        <w:t>0</w:t>
+      </w:r>
+      <w:r>
+        <w:rPr>
+          <w:rFonts w:ascii="Courier New" w:eastAsia="Times New Roman" w:hAnsi="Courier New" w:cs="Courier New"/>
+          <w:color w:val="BCBEC4"/>
+          <w:sz w:val="20"/>
+          <w:szCs w:val="20"/>
+          <w:lang w:eastAsia="es-ES"/>
+        </w:rPr>
+        <w:t>;</w:t>
+      </w:r>
+      <w:r>
+        <w:rPr>
+          <w:rFonts w:ascii="Courier New" w:eastAsia="Times New Roman" w:hAnsi="Courier New" w:cs="Courier New"/>
+          <w:color w:val="BCBEC4"/>
+          <w:sz w:val="20"/>
+          <w:szCs w:val="20"/>
+          <w:lang w:eastAsia="es-ES"/>
+        </w:rPr>
+        <w:br/>
+        <w:t>}</w:t>
+      </w:r>
+    </w:p>
+    <w:p>
+      <w:pPr>
+        <w:kinsoku w:val="0"/>
+        <w:overflowPunct w:val="0"/>
+        <w:rPr>
+          <w:sz w:val="24"/>
+          <w:szCs w:val="24"/>
+        </w:rPr>
+      </w:pPr>
+      <w:r>
+        <w:rPr>
+          <w:sz w:val="24"/>
+          <w:szCs w:val="24"/>
+        </w:rPr>
+        <w:t xml:space="preserve">El primer test no dio </w:t>
+      </w:r>
+      <w:r>
+        <w:rPr>
+          <w:sz w:val="24"/>
+          <w:szCs w:val="24"/>
+        </w:rPr>
+        <w:t>problemas,</w:t>
+      </w:r>
+      <w:r>
+        <w:rPr>
+          <w:sz w:val="24"/>
+          <w:szCs w:val="24"/>
+        </w:rPr>
+        <w:t xml:space="preserve"> pero el segundo sí ya que la tolerancia establecida en TOL_ es de 10e-14, tuve que añadir una segunda tolerancia TOL2_ con valor 10e-10 para poder pasar el test correctamente.</w:t>
+      </w:r>
+    </w:p>
+    <w:p>
+      <w:pPr>
+        <w:kinsoku w:val="0"/>
+        <w:overflowPunct w:val="0"/>
+        <w:rPr>
+          <w:color w:val="FF0000"/>
+          <w:sz w:val="32"/>
+          <w:szCs w:val="32"/>
+        </w:rPr>
+      </w:pPr>
+      <w:proofErr w:type="spellStart"/>
+      <w:r>
+        <w:rPr>
+          <w:color w:val="FF0000"/>
+          <w:sz w:val="32"/>
+          <w:szCs w:val="32"/>
+        </w:rPr>
+        <w:t>R_x</w:t>
+      </w:r>
+      <w:proofErr w:type="spellEnd"/>
+      <w:r>
+        <w:rPr>
+          <w:color w:val="FF0000"/>
+          <w:sz w:val="32"/>
+          <w:szCs w:val="32"/>
+        </w:rPr>
+        <w:t xml:space="preserve">, </w:t>
+      </w:r>
+      <w:proofErr w:type="spellStart"/>
+      <w:r>
+        <w:rPr>
+          <w:color w:val="FF0000"/>
+          <w:sz w:val="32"/>
+          <w:szCs w:val="32"/>
+        </w:rPr>
+        <w:t>R_y</w:t>
+      </w:r>
+      <w:proofErr w:type="spellEnd"/>
+      <w:r>
+        <w:rPr>
+          <w:color w:val="FF0000"/>
+          <w:sz w:val="32"/>
+          <w:szCs w:val="32"/>
+        </w:rPr>
+        <w:t xml:space="preserve">, </w:t>
+      </w:r>
+      <w:proofErr w:type="spellStart"/>
+      <w:r>
+        <w:rPr>
+          <w:color w:val="FF0000"/>
+          <w:sz w:val="32"/>
+          <w:szCs w:val="32"/>
+        </w:rPr>
+        <w:t>R_z</w:t>
+      </w:r>
+      <w:proofErr w:type="spellEnd"/>
+      <w:r>
+        <w:rPr>
+          <w:color w:val="FF0000"/>
+          <w:sz w:val="32"/>
+          <w:szCs w:val="32"/>
+        </w:rPr>
+        <w:t>:</w:t>
+      </w:r>
+    </w:p>
+    <w:p>
+      <w:pPr>
+        <w:kinsoku w:val="0"/>
+        <w:overflowPunct w:val="0"/>
+        <w:rPr>
+          <w:sz w:val="24"/>
+          <w:szCs w:val="24"/>
+        </w:rPr>
+      </w:pPr>
+      <w:proofErr w:type="spellStart"/>
+      <w:r>
+        <w:rPr>
+          <w:sz w:val="24"/>
+          <w:szCs w:val="24"/>
+        </w:rPr>
+        <w:t>Tests</w:t>
+      </w:r>
+      <w:proofErr w:type="spellEnd"/>
+      <w:r>
+        <w:rPr>
+          <w:sz w:val="24"/>
+          <w:szCs w:val="24"/>
+        </w:rPr>
+        <w:t xml:space="preserve"> unitarios creados:</w:t>
+      </w:r>
+    </w:p>
+    <w:p>
+      <w:pPr>
+        <w:pStyle w:val="HTMLconformatoprevio"/>
+        <w:shd w:val="clear" w:color="auto" w:fill="1E1F22"/>
+        <w:rPr>
+          <w:color w:val="BCBEC4"/>
+        </w:rPr>
+      </w:pPr>
+      <w:proofErr w:type="spellStart"/>
+      <w:r>
+        <w:rPr>
+          <w:color w:val="CF8E6D"/>
+        </w:rPr>
+        <w:t>int</w:t>
+      </w:r>
+      <w:proofErr w:type="spellEnd"/>
+      <w:r>
+        <w:rPr>
+          <w:color w:val="CF8E6D"/>
+        </w:rPr>
+        <w:t xml:space="preserve"> </w:t>
+      </w:r>
+      <w:r>
+        <w:rPr>
+          <w:color w:val="56A8F5"/>
+        </w:rPr>
+        <w:t>R_x_01</w:t>
+      </w:r>
+      <w:proofErr w:type="gramStart"/>
+      <w:r>
+        <w:rPr>
+          <w:color w:val="BCBEC4"/>
+        </w:rPr>
+        <w:t>(){</w:t>
+      </w:r>
+      <w:proofErr w:type="gramEnd"/>
+      <w:r>
+        <w:rPr>
+          <w:color w:val="BCBEC4"/>
+        </w:rPr>
+        <w:br/>
+        <w:t xml:space="preserve">    </w:t>
+      </w:r>
+      <w:proofErr w:type="spellStart"/>
+      <w:r>
+        <w:rPr>
+          <w:color w:val="CF8E6D"/>
+        </w:rPr>
+        <w:t>double</w:t>
+      </w:r>
+      <w:proofErr w:type="spellEnd"/>
+      <w:r>
+        <w:rPr>
+          <w:color w:val="CF8E6D"/>
+        </w:rPr>
+        <w:t xml:space="preserve"> </w:t>
+      </w:r>
+      <w:proofErr w:type="spellStart"/>
+      <w:r>
+        <w:rPr>
+          <w:color w:val="BCBEC4"/>
+        </w:rPr>
+        <w:t>alpha</w:t>
+      </w:r>
+      <w:proofErr w:type="spellEnd"/>
+      <w:r>
+        <w:rPr>
+          <w:color w:val="BCBEC4"/>
+        </w:rPr>
+        <w:t xml:space="preserve"> = </w:t>
+      </w:r>
+      <w:r>
+        <w:rPr>
+          <w:color w:val="2AACB8"/>
+        </w:rPr>
+        <w:t>1.0</w:t>
+      </w:r>
+      <w:r>
+        <w:rPr>
+          <w:color w:val="BCBEC4"/>
+        </w:rPr>
+        <w:t>;</w:t>
+      </w:r>
+      <w:r>
+        <w:rPr>
+          <w:color w:val="BCBEC4"/>
+        </w:rPr>
+        <w:br/>
+        <w:t xml:space="preserve">    </w:t>
+      </w:r>
+      <w:r>
+        <w:rPr>
+          <w:color w:val="B5B6E3"/>
+        </w:rPr>
+        <w:t xml:space="preserve">Matrix </w:t>
+      </w:r>
+      <w:r>
+        <w:rPr>
+          <w:color w:val="BCBEC4"/>
+        </w:rPr>
+        <w:t>sol(</w:t>
+      </w:r>
+      <w:r>
+        <w:rPr>
+          <w:color w:val="2AACB8"/>
+        </w:rPr>
+        <w:t>3</w:t>
+      </w:r>
+      <w:r>
+        <w:rPr>
+          <w:color w:val="BCBEC4"/>
+        </w:rPr>
+        <w:t>,</w:t>
+      </w:r>
+      <w:r>
+        <w:rPr>
+          <w:color w:val="2AACB8"/>
+        </w:rPr>
+        <w:t>3</w:t>
+      </w:r>
+      <w:r>
+        <w:rPr>
+          <w:color w:val="BCBEC4"/>
+        </w:rPr>
+        <w:t>);</w:t>
+      </w:r>
+      <w:r>
+        <w:rPr>
+          <w:color w:val="BCBEC4"/>
+        </w:rPr>
+        <w:br/>
+      </w:r>
+      <w:r>
+        <w:rPr>
+          <w:color w:val="BCBEC4"/>
+        </w:rPr>
+        <w:br/>
+        <w:t xml:space="preserve">    sol </w:t>
+      </w:r>
+      <w:r>
+        <w:rPr>
+          <w:color w:val="5F8C8A"/>
+        </w:rPr>
+        <w:t xml:space="preserve">= </w:t>
+      </w:r>
+      <w:proofErr w:type="spellStart"/>
+      <w:r>
+        <w:rPr>
+          <w:color w:val="BCBEC4"/>
+        </w:rPr>
+        <w:t>R_x</w:t>
+      </w:r>
+      <w:proofErr w:type="spellEnd"/>
+      <w:r>
+        <w:rPr>
+          <w:color w:val="BCBEC4"/>
+        </w:rPr>
+        <w:t>(</w:t>
+      </w:r>
+      <w:proofErr w:type="spellStart"/>
+      <w:r>
+        <w:rPr>
+          <w:color w:val="BCBEC4"/>
+        </w:rPr>
+        <w:t>alpha</w:t>
+      </w:r>
+      <w:proofErr w:type="spellEnd"/>
+      <w:r>
+        <w:rPr>
+          <w:color w:val="BCBEC4"/>
+        </w:rPr>
+        <w:t>);</w:t>
+      </w:r>
+      <w:r>
+        <w:rPr>
+          <w:color w:val="BCBEC4"/>
+        </w:rPr>
+        <w:br/>
+      </w:r>
+      <w:r>
+        <w:rPr>
+          <w:color w:val="BCBEC4"/>
+        </w:rPr>
+        <w:br/>
+        <w:t xml:space="preserve">    </w:t>
+      </w:r>
+      <w:r>
+        <w:rPr>
+          <w:color w:val="908B25"/>
+        </w:rPr>
+        <w:t>_</w:t>
+      </w:r>
+      <w:proofErr w:type="spellStart"/>
+      <w:r>
+        <w:rPr>
+          <w:color w:val="908B25"/>
+        </w:rPr>
+        <w:t>assert</w:t>
+      </w:r>
+      <w:proofErr w:type="spellEnd"/>
+      <w:r>
+        <w:rPr>
+          <w:color w:val="BCBEC4"/>
+        </w:rPr>
+        <w:t>(</w:t>
+      </w:r>
+      <w:proofErr w:type="spellStart"/>
+      <w:r>
+        <w:rPr>
+          <w:color w:val="BCBEC4"/>
+        </w:rPr>
+        <w:t>fabs</w:t>
+      </w:r>
+      <w:proofErr w:type="spellEnd"/>
+      <w:r>
+        <w:rPr>
+          <w:color w:val="BCBEC4"/>
+        </w:rPr>
+        <w:t>(sol</w:t>
+      </w:r>
+      <w:r>
+        <w:rPr>
+          <w:color w:val="5F8C8A"/>
+        </w:rPr>
+        <w:t>(</w:t>
+      </w:r>
+      <w:r>
+        <w:rPr>
+          <w:color w:val="2AACB8"/>
+        </w:rPr>
+        <w:t>1</w:t>
+      </w:r>
+      <w:r>
+        <w:rPr>
+          <w:color w:val="BCBEC4"/>
+        </w:rPr>
+        <w:t>,</w:t>
+      </w:r>
+      <w:r>
+        <w:rPr>
+          <w:color w:val="2AACB8"/>
+        </w:rPr>
+        <w:t>1</w:t>
+      </w:r>
+      <w:r>
+        <w:rPr>
+          <w:color w:val="5F8C8A"/>
+        </w:rPr>
+        <w:t xml:space="preserve">) </w:t>
+      </w:r>
+      <w:r>
+        <w:rPr>
+          <w:color w:val="BCBEC4"/>
+        </w:rPr>
+        <w:t xml:space="preserve">- </w:t>
+      </w:r>
+      <w:r>
+        <w:rPr>
+          <w:color w:val="2AACB8"/>
+        </w:rPr>
+        <w:t xml:space="preserve">1 </w:t>
+      </w:r>
+      <w:r>
+        <w:rPr>
+          <w:color w:val="BCBEC4"/>
+        </w:rPr>
+        <w:t>&lt; TOL_ &amp;&amp;</w:t>
+      </w:r>
+      <w:r>
+        <w:rPr>
+          <w:color w:val="BCBEC4"/>
+        </w:rPr>
+        <w:br/>
+        <w:t xml:space="preserve">    </w:t>
+      </w:r>
+      <w:proofErr w:type="spellStart"/>
+      <w:r>
+        <w:rPr>
+          <w:color w:val="BCBEC4"/>
+        </w:rPr>
+        <w:t>fabs</w:t>
+      </w:r>
+      <w:proofErr w:type="spellEnd"/>
+      <w:r>
+        <w:rPr>
+          <w:color w:val="BCBEC4"/>
+        </w:rPr>
+        <w:t>(sol</w:t>
+      </w:r>
+      <w:r>
+        <w:rPr>
+          <w:color w:val="5F8C8A"/>
+        </w:rPr>
+        <w:t>(</w:t>
+      </w:r>
+      <w:r>
+        <w:rPr>
+          <w:color w:val="2AACB8"/>
+        </w:rPr>
+        <w:t>1</w:t>
+      </w:r>
+      <w:r>
+        <w:rPr>
+          <w:color w:val="BCBEC4"/>
+        </w:rPr>
+        <w:t>,</w:t>
+      </w:r>
+      <w:r>
+        <w:rPr>
+          <w:color w:val="2AACB8"/>
+        </w:rPr>
+        <w:t>2</w:t>
+      </w:r>
+      <w:r>
+        <w:rPr>
+          <w:color w:val="5F8C8A"/>
+        </w:rPr>
+        <w:t>)</w:t>
+      </w:r>
+      <w:r>
+        <w:rPr>
+          <w:color w:val="BCBEC4"/>
+        </w:rPr>
+        <w:t xml:space="preserve">) &lt; TOL_ &amp;&amp; </w:t>
+      </w:r>
+      <w:proofErr w:type="spellStart"/>
+      <w:r>
+        <w:rPr>
+          <w:color w:val="BCBEC4"/>
+        </w:rPr>
+        <w:t>fabs</w:t>
+      </w:r>
+      <w:proofErr w:type="spellEnd"/>
+      <w:r>
+        <w:rPr>
+          <w:color w:val="BCBEC4"/>
+        </w:rPr>
+        <w:t>(sol</w:t>
+      </w:r>
+      <w:r>
+        <w:rPr>
+          <w:color w:val="5F8C8A"/>
+        </w:rPr>
+        <w:t>(</w:t>
+      </w:r>
+      <w:r>
+        <w:rPr>
+          <w:color w:val="2AACB8"/>
+        </w:rPr>
+        <w:t>1</w:t>
+      </w:r>
+      <w:r>
+        <w:rPr>
+          <w:color w:val="BCBEC4"/>
+        </w:rPr>
+        <w:t>,</w:t>
+      </w:r>
+      <w:r>
+        <w:rPr>
+          <w:color w:val="2AACB8"/>
+        </w:rPr>
+        <w:t>3</w:t>
+      </w:r>
+      <w:r>
+        <w:rPr>
+          <w:color w:val="5F8C8A"/>
+        </w:rPr>
+        <w:t>)</w:t>
+      </w:r>
+      <w:r>
+        <w:rPr>
+          <w:color w:val="BCBEC4"/>
+        </w:rPr>
+        <w:t>&lt;TOL_)));</w:t>
+      </w:r>
+      <w:r>
+        <w:rPr>
+          <w:color w:val="BCBEC4"/>
+        </w:rPr>
+        <w:br/>
+        <w:t xml:space="preserve">    </w:t>
+      </w:r>
+      <w:r>
+        <w:rPr>
+          <w:color w:val="908B25"/>
+        </w:rPr>
+        <w:t>_</w:t>
+      </w:r>
+      <w:proofErr w:type="spellStart"/>
+      <w:r>
+        <w:rPr>
+          <w:color w:val="908B25"/>
+        </w:rPr>
+        <w:t>assert</w:t>
+      </w:r>
+      <w:proofErr w:type="spellEnd"/>
+      <w:r>
+        <w:rPr>
+          <w:color w:val="BCBEC4"/>
+        </w:rPr>
+        <w:t>(sol</w:t>
+      </w:r>
+      <w:r>
+        <w:rPr>
+          <w:color w:val="5F8C8A"/>
+        </w:rPr>
+        <w:t>(</w:t>
+      </w:r>
+      <w:r>
+        <w:rPr>
+          <w:color w:val="2AACB8"/>
+        </w:rPr>
+        <w:t>2</w:t>
+      </w:r>
+      <w:r>
+        <w:rPr>
+          <w:color w:val="BCBEC4"/>
+        </w:rPr>
+        <w:t>,</w:t>
+      </w:r>
+      <w:r>
+        <w:rPr>
+          <w:color w:val="2AACB8"/>
+        </w:rPr>
+        <w:t>1</w:t>
+      </w:r>
+      <w:r>
+        <w:rPr>
+          <w:color w:val="5F8C8A"/>
+        </w:rPr>
+        <w:t>)</w:t>
+      </w:r>
+      <w:r>
+        <w:rPr>
+          <w:color w:val="BCBEC4"/>
+        </w:rPr>
+        <w:t xml:space="preserve">&lt;TOL_ &amp;&amp; </w:t>
+      </w:r>
+      <w:proofErr w:type="spellStart"/>
+      <w:r>
+        <w:rPr>
+          <w:color w:val="BCBEC4"/>
+        </w:rPr>
+        <w:t>fabs</w:t>
+      </w:r>
+      <w:proofErr w:type="spellEnd"/>
+      <w:r>
+        <w:rPr>
+          <w:color w:val="BCBEC4"/>
+        </w:rPr>
+        <w:t>(sol</w:t>
+      </w:r>
+      <w:r>
+        <w:rPr>
+          <w:color w:val="5F8C8A"/>
+        </w:rPr>
+        <w:t>(</w:t>
+      </w:r>
+      <w:r>
+        <w:rPr>
+          <w:color w:val="2AACB8"/>
+        </w:rPr>
+        <w:t>2</w:t>
+      </w:r>
+      <w:r>
+        <w:rPr>
+          <w:color w:val="BCBEC4"/>
+        </w:rPr>
+        <w:t>,</w:t>
+      </w:r>
+      <w:r>
+        <w:rPr>
+          <w:color w:val="2AACB8"/>
+        </w:rPr>
+        <w:t>2</w:t>
+      </w:r>
+      <w:r>
+        <w:rPr>
+          <w:color w:val="5F8C8A"/>
+        </w:rPr>
+        <w:t>)</w:t>
+      </w:r>
+      <w:r>
+        <w:rPr>
+          <w:color w:val="BCBEC4"/>
+        </w:rPr>
+        <w:t>-</w:t>
+      </w:r>
+      <w:r>
+        <w:rPr>
+          <w:color w:val="2AACB8"/>
+        </w:rPr>
+        <w:t>0.54030230586814</w:t>
+      </w:r>
+      <w:r>
+        <w:rPr>
+          <w:color w:val="BCBEC4"/>
+        </w:rPr>
+        <w:t xml:space="preserve">) &lt; TOL_ &amp;&amp; </w:t>
+      </w:r>
+      <w:proofErr w:type="spellStart"/>
+      <w:r>
+        <w:rPr>
+          <w:color w:val="BCBEC4"/>
+        </w:rPr>
+        <w:t>fabs</w:t>
+      </w:r>
+      <w:proofErr w:type="spellEnd"/>
+      <w:r>
+        <w:rPr>
+          <w:color w:val="BCBEC4"/>
+        </w:rPr>
+        <w:t>(sol</w:t>
+      </w:r>
+      <w:r>
+        <w:rPr>
+          <w:color w:val="5F8C8A"/>
+        </w:rPr>
+        <w:t>(</w:t>
+      </w:r>
+      <w:r>
+        <w:rPr>
+          <w:color w:val="2AACB8"/>
+        </w:rPr>
+        <w:t>2</w:t>
+      </w:r>
+      <w:r>
+        <w:rPr>
+          <w:color w:val="BCBEC4"/>
+        </w:rPr>
+        <w:t>,</w:t>
+      </w:r>
+      <w:r>
+        <w:rPr>
+          <w:color w:val="2AACB8"/>
+        </w:rPr>
+        <w:t>3</w:t>
+      </w:r>
+      <w:r>
+        <w:rPr>
+          <w:color w:val="5F8C8A"/>
+        </w:rPr>
+        <w:t>)</w:t>
+      </w:r>
+      <w:r>
+        <w:rPr>
+          <w:color w:val="5F8C8A"/>
+        </w:rPr>
+        <w:br/>
+        <w:t xml:space="preserve">    </w:t>
+      </w:r>
+      <w:r>
+        <w:rPr>
+          <w:color w:val="BCBEC4"/>
+        </w:rPr>
+        <w:t>-</w:t>
+      </w:r>
+      <w:r>
+        <w:rPr>
+          <w:color w:val="2AACB8"/>
+        </w:rPr>
+        <w:t>0.841470984807897</w:t>
+      </w:r>
+      <w:r>
+        <w:rPr>
+          <w:color w:val="BCBEC4"/>
+        </w:rPr>
+        <w:t>) &lt; TOL_);</w:t>
+      </w:r>
+      <w:r>
+        <w:rPr>
+          <w:color w:val="BCBEC4"/>
+        </w:rPr>
+        <w:br/>
+        <w:t xml:space="preserve">    </w:t>
+      </w:r>
+      <w:r>
+        <w:rPr>
+          <w:color w:val="908B25"/>
+        </w:rPr>
+        <w:t>_</w:t>
+      </w:r>
+      <w:proofErr w:type="spellStart"/>
+      <w:r>
+        <w:rPr>
+          <w:color w:val="908B25"/>
+        </w:rPr>
+        <w:t>assert</w:t>
+      </w:r>
+      <w:proofErr w:type="spellEnd"/>
+      <w:r>
+        <w:rPr>
+          <w:color w:val="BCBEC4"/>
+        </w:rPr>
+        <w:t>(</w:t>
+      </w:r>
+      <w:proofErr w:type="spellStart"/>
+      <w:r>
+        <w:rPr>
+          <w:color w:val="BCBEC4"/>
+        </w:rPr>
+        <w:t>fabs</w:t>
+      </w:r>
+      <w:proofErr w:type="spellEnd"/>
+      <w:r>
+        <w:rPr>
+          <w:color w:val="BCBEC4"/>
+        </w:rPr>
+        <w:t>(sol</w:t>
+      </w:r>
+      <w:r>
+        <w:rPr>
+          <w:color w:val="5F8C8A"/>
+        </w:rPr>
+        <w:t>(</w:t>
+      </w:r>
+      <w:r>
+        <w:rPr>
+          <w:color w:val="2AACB8"/>
+        </w:rPr>
+        <w:t>1</w:t>
+      </w:r>
+      <w:r>
+        <w:rPr>
+          <w:color w:val="BCBEC4"/>
+        </w:rPr>
+        <w:t>,</w:t>
+      </w:r>
+      <w:r>
+        <w:rPr>
+          <w:color w:val="2AACB8"/>
+        </w:rPr>
+        <w:t>1</w:t>
+      </w:r>
+      <w:r>
+        <w:rPr>
+          <w:color w:val="5F8C8A"/>
+        </w:rPr>
+        <w:t>)</w:t>
+      </w:r>
+      <w:r>
+        <w:rPr>
+          <w:color w:val="BCBEC4"/>
+        </w:rPr>
+        <w:t xml:space="preserve">)- </w:t>
+      </w:r>
+      <w:r>
+        <w:rPr>
+          <w:color w:val="2AACB8"/>
+        </w:rPr>
+        <w:t xml:space="preserve">1 </w:t>
+      </w:r>
+      <w:r>
+        <w:rPr>
+          <w:color w:val="BCBEC4"/>
+        </w:rPr>
+        <w:t>&lt; TOL_);</w:t>
+      </w:r>
+      <w:r>
+        <w:rPr>
+          <w:color w:val="BCBEC4"/>
+        </w:rPr>
+        <w:br/>
+      </w:r>
+      <w:r>
+        <w:rPr>
+          <w:color w:val="BCBEC4"/>
+        </w:rPr>
+        <w:br/>
+        <w:t xml:space="preserve">    </w:t>
+      </w:r>
+      <w:proofErr w:type="spellStart"/>
+      <w:r>
+        <w:rPr>
+          <w:color w:val="CF8E6D"/>
+        </w:rPr>
+        <w:t>return</w:t>
+      </w:r>
+      <w:proofErr w:type="spellEnd"/>
+      <w:r>
+        <w:rPr>
+          <w:color w:val="CF8E6D"/>
+        </w:rPr>
+        <w:t xml:space="preserve"> </w:t>
+      </w:r>
+      <w:r>
+        <w:rPr>
+          <w:color w:val="2AACB8"/>
+        </w:rPr>
+        <w:t>0</w:t>
+      </w:r>
+      <w:r>
+        <w:rPr>
+          <w:color w:val="BCBEC4"/>
+        </w:rPr>
+        <w:t>;</w:t>
+      </w:r>
+      <w:r>
+        <w:rPr>
+          <w:color w:val="BCBEC4"/>
+        </w:rPr>
+        <w:br/>
+      </w:r>
+      <w:r>
+        <w:rPr>
+          <w:color w:val="BCBEC4"/>
+        </w:rPr>
+        <w:br/>
+        <w:t>}</w:t>
+      </w:r>
+    </w:p>
+    <w:p>
+      <w:pPr>
+        <w:pStyle w:val="HTMLconformatoprevio"/>
+        <w:shd w:val="clear" w:color="auto" w:fill="1E1F22"/>
+        <w:rPr>
+          <w:color w:val="BCBEC4"/>
+        </w:rPr>
+      </w:pPr>
+      <w:proofErr w:type="spellStart"/>
+      <w:r>
+        <w:rPr>
+          <w:color w:val="CF8E6D"/>
+        </w:rPr>
+        <w:t>int</w:t>
+      </w:r>
+      <w:proofErr w:type="spellEnd"/>
+      <w:r>
+        <w:rPr>
+          <w:color w:val="CF8E6D"/>
+        </w:rPr>
+        <w:t xml:space="preserve"> </w:t>
+      </w:r>
+      <w:r>
+        <w:rPr>
+          <w:color w:val="56A8F5"/>
+        </w:rPr>
+        <w:t>R_y_01</w:t>
+      </w:r>
+      <w:r>
+        <w:rPr>
+          <w:color w:val="BCBEC4"/>
+        </w:rPr>
+        <w:t>(){</w:t>
+      </w:r>
+      <w:r>
+        <w:rPr>
+          <w:color w:val="BCBEC4"/>
+        </w:rPr>
+        <w:br/>
+        <w:t xml:space="preserve">    </w:t>
+      </w:r>
+      <w:proofErr w:type="spellStart"/>
+      <w:r>
+        <w:rPr>
+          <w:color w:val="CF8E6D"/>
+        </w:rPr>
+        <w:t>double</w:t>
+      </w:r>
+      <w:proofErr w:type="spellEnd"/>
+      <w:r>
+        <w:rPr>
+          <w:color w:val="CF8E6D"/>
+        </w:rPr>
+        <w:t xml:space="preserve"> </w:t>
+      </w:r>
+      <w:proofErr w:type="spellStart"/>
+      <w:r>
+        <w:rPr>
+          <w:color w:val="BCBEC4"/>
+        </w:rPr>
+        <w:t>alpha</w:t>
+      </w:r>
+      <w:proofErr w:type="spellEnd"/>
+      <w:r>
+        <w:rPr>
+          <w:color w:val="BCBEC4"/>
+        </w:rPr>
+        <w:t xml:space="preserve"> = </w:t>
+      </w:r>
+      <w:r>
+        <w:rPr>
+          <w:color w:val="2AACB8"/>
+        </w:rPr>
+        <w:t>1.0</w:t>
+      </w:r>
+      <w:r>
+        <w:rPr>
+          <w:color w:val="BCBEC4"/>
+        </w:rPr>
+        <w:t>;</w:t>
+      </w:r>
+      <w:r>
+        <w:rPr>
+          <w:color w:val="BCBEC4"/>
+        </w:rPr>
+        <w:br/>
+        <w:t xml:space="preserve">    </w:t>
+      </w:r>
+      <w:r>
+        <w:rPr>
+          <w:color w:val="B5B6E3"/>
+        </w:rPr>
+        <w:t xml:space="preserve">Matrix </w:t>
+      </w:r>
+      <w:r>
+        <w:rPr>
+          <w:color w:val="BCBEC4"/>
+        </w:rPr>
+        <w:t>sol(</w:t>
+      </w:r>
+      <w:r>
+        <w:rPr>
+          <w:color w:val="2AACB8"/>
+        </w:rPr>
+        <w:t>3</w:t>
+      </w:r>
+      <w:r>
+        <w:rPr>
+          <w:color w:val="BCBEC4"/>
+        </w:rPr>
+        <w:t>,</w:t>
+      </w:r>
+      <w:r>
+        <w:rPr>
+          <w:color w:val="2AACB8"/>
+        </w:rPr>
+        <w:t>3</w:t>
+      </w:r>
+      <w:r>
+        <w:rPr>
+          <w:color w:val="BCBEC4"/>
+        </w:rPr>
+        <w:t>);</w:t>
+      </w:r>
+      <w:r>
+        <w:rPr>
+          <w:color w:val="BCBEC4"/>
+        </w:rPr>
+        <w:br/>
+      </w:r>
+      <w:r>
+        <w:rPr>
+          <w:color w:val="BCBEC4"/>
+        </w:rPr>
+        <w:br/>
+        <w:t xml:space="preserve">    sol </w:t>
+      </w:r>
+      <w:r>
+        <w:rPr>
+          <w:color w:val="5F8C8A"/>
+        </w:rPr>
+        <w:t xml:space="preserve">= </w:t>
+      </w:r>
+      <w:proofErr w:type="spellStart"/>
+      <w:r>
+        <w:rPr>
+          <w:color w:val="BCBEC4"/>
+        </w:rPr>
+        <w:t>R_y</w:t>
+      </w:r>
+      <w:proofErr w:type="spellEnd"/>
+      <w:r>
+        <w:rPr>
+          <w:color w:val="BCBEC4"/>
+        </w:rPr>
+        <w:t>(</w:t>
+      </w:r>
+      <w:proofErr w:type="spellStart"/>
+      <w:r>
+        <w:rPr>
+          <w:color w:val="BCBEC4"/>
+        </w:rPr>
+        <w:t>alpha</w:t>
+      </w:r>
+      <w:proofErr w:type="spellEnd"/>
+      <w:r>
+        <w:rPr>
+          <w:color w:val="BCBEC4"/>
+        </w:rPr>
+        <w:t>);</w:t>
+      </w:r>
+      <w:r>
+        <w:rPr>
+          <w:color w:val="BCBEC4"/>
+        </w:rPr>
+        <w:br/>
+      </w:r>
+      <w:r>
+        <w:rPr>
+          <w:color w:val="BCBEC4"/>
+        </w:rPr>
+        <w:br/>
+        <w:t xml:space="preserve">    </w:t>
+      </w:r>
+      <w:r>
+        <w:rPr>
+          <w:color w:val="908B25"/>
+        </w:rPr>
+        <w:t>_</w:t>
+      </w:r>
+      <w:proofErr w:type="spellStart"/>
+      <w:r>
+        <w:rPr>
+          <w:color w:val="908B25"/>
+        </w:rPr>
+        <w:t>assert</w:t>
+      </w:r>
+      <w:proofErr w:type="spellEnd"/>
+      <w:r>
+        <w:rPr>
+          <w:color w:val="BCBEC4"/>
+        </w:rPr>
+        <w:t>(</w:t>
+      </w:r>
+      <w:proofErr w:type="spellStart"/>
+      <w:r>
+        <w:rPr>
+          <w:color w:val="BCBEC4"/>
+        </w:rPr>
+        <w:t>fabs</w:t>
+      </w:r>
+      <w:proofErr w:type="spellEnd"/>
+      <w:r>
+        <w:rPr>
+          <w:color w:val="BCBEC4"/>
+        </w:rPr>
+        <w:t>(sol</w:t>
+      </w:r>
+      <w:r>
+        <w:rPr>
+          <w:color w:val="5F8C8A"/>
+        </w:rPr>
+        <w:t>(</w:t>
+      </w:r>
+      <w:r>
+        <w:rPr>
+          <w:color w:val="2AACB8"/>
+        </w:rPr>
+        <w:t>1</w:t>
+      </w:r>
+      <w:r>
+        <w:rPr>
+          <w:color w:val="BCBEC4"/>
+        </w:rPr>
+        <w:t>,</w:t>
+      </w:r>
+      <w:r>
+        <w:rPr>
+          <w:color w:val="2AACB8"/>
+        </w:rPr>
+        <w:t>1</w:t>
+      </w:r>
+      <w:r>
+        <w:rPr>
+          <w:color w:val="5F8C8A"/>
+        </w:rPr>
+        <w:t xml:space="preserve">) </w:t>
+      </w:r>
+      <w:r>
+        <w:rPr>
+          <w:color w:val="BCBEC4"/>
+        </w:rPr>
+        <w:t xml:space="preserve">- </w:t>
+      </w:r>
+      <w:r>
+        <w:rPr>
+          <w:color w:val="2AACB8"/>
+        </w:rPr>
+        <w:t>0.54030230586814</w:t>
+      </w:r>
+      <w:r>
+        <w:rPr>
+          <w:color w:val="BCBEC4"/>
+        </w:rPr>
+        <w:t xml:space="preserve">) &lt; TOL2_ &amp;&amp; </w:t>
+      </w:r>
+      <w:proofErr w:type="spellStart"/>
+      <w:r>
+        <w:rPr>
+          <w:color w:val="BCBEC4"/>
+        </w:rPr>
+        <w:t>fabs</w:t>
+      </w:r>
+      <w:proofErr w:type="spellEnd"/>
+      <w:r>
+        <w:rPr>
+          <w:color w:val="BCBEC4"/>
+        </w:rPr>
+        <w:t>(sol</w:t>
+      </w:r>
+      <w:r>
+        <w:rPr>
+          <w:color w:val="5F8C8A"/>
+        </w:rPr>
+        <w:t>(</w:t>
+      </w:r>
+      <w:r>
+        <w:rPr>
+          <w:color w:val="2AACB8"/>
+        </w:rPr>
+        <w:t>1</w:t>
+      </w:r>
+      <w:r>
+        <w:rPr>
+          <w:color w:val="BCBEC4"/>
+        </w:rPr>
+        <w:t>,</w:t>
+      </w:r>
+      <w:r>
+        <w:rPr>
+          <w:color w:val="2AACB8"/>
+        </w:rPr>
+        <w:t>3</w:t>
+      </w:r>
+      <w:r>
+        <w:rPr>
+          <w:color w:val="5F8C8A"/>
+        </w:rPr>
+        <w:t xml:space="preserve">) </w:t>
+      </w:r>
+      <w:r>
+        <w:rPr>
+          <w:color w:val="BCBEC4"/>
+        </w:rPr>
+        <w:t xml:space="preserve">+ </w:t>
+      </w:r>
+      <w:r>
+        <w:rPr>
+          <w:color w:val="2AACB8"/>
+        </w:rPr>
+        <w:t>0.841470984807897</w:t>
+      </w:r>
+      <w:r>
+        <w:rPr>
+          <w:color w:val="BCBEC4"/>
+        </w:rPr>
+        <w:t>) &lt; TOL2_);</w:t>
+      </w:r>
+      <w:r>
+        <w:rPr>
+          <w:color w:val="BCBEC4"/>
+        </w:rPr>
+        <w:br/>
+      </w:r>
+      <w:r>
+        <w:rPr>
+          <w:color w:val="BCBEC4"/>
+        </w:rPr>
+        <w:br/>
+        <w:t xml:space="preserve">    </w:t>
+      </w:r>
+      <w:r>
+        <w:rPr>
+          <w:color w:val="908B25"/>
+        </w:rPr>
+        <w:t>_</w:t>
+      </w:r>
+      <w:proofErr w:type="spellStart"/>
+      <w:r>
+        <w:rPr>
+          <w:color w:val="908B25"/>
+        </w:rPr>
+        <w:t>assert</w:t>
+      </w:r>
+      <w:proofErr w:type="spellEnd"/>
+      <w:r>
+        <w:rPr>
+          <w:color w:val="BCBEC4"/>
+        </w:rPr>
+        <w:t>(</w:t>
+      </w:r>
+      <w:proofErr w:type="spellStart"/>
+      <w:r>
+        <w:rPr>
+          <w:color w:val="BCBEC4"/>
+        </w:rPr>
+        <w:t>fabs</w:t>
+      </w:r>
+      <w:proofErr w:type="spellEnd"/>
+      <w:r>
+        <w:rPr>
+          <w:color w:val="BCBEC4"/>
+        </w:rPr>
+        <w:t>(sol</w:t>
+      </w:r>
+      <w:r>
+        <w:rPr>
+          <w:color w:val="5F8C8A"/>
+        </w:rPr>
+        <w:t>(</w:t>
+      </w:r>
+      <w:r>
+        <w:rPr>
+          <w:color w:val="2AACB8"/>
+        </w:rPr>
+        <w:t>2</w:t>
+      </w:r>
+      <w:r>
+        <w:rPr>
+          <w:color w:val="BCBEC4"/>
+        </w:rPr>
+        <w:t>,</w:t>
+      </w:r>
+      <w:r>
+        <w:rPr>
+          <w:color w:val="2AACB8"/>
+        </w:rPr>
+        <w:t>1</w:t>
+      </w:r>
+      <w:r>
+        <w:rPr>
+          <w:color w:val="5F8C8A"/>
+        </w:rPr>
+        <w:t>)</w:t>
+      </w:r>
+      <w:r>
+        <w:rPr>
+          <w:color w:val="BCBEC4"/>
+        </w:rPr>
+        <w:t>-</w:t>
+      </w:r>
+      <w:r>
+        <w:rPr>
+          <w:color w:val="2AACB8"/>
+        </w:rPr>
+        <w:t>0</w:t>
+      </w:r>
+      <w:r>
+        <w:rPr>
+          <w:color w:val="BCBEC4"/>
+        </w:rPr>
+        <w:t xml:space="preserve">&lt;TOL2_) &amp;&amp; </w:t>
+      </w:r>
+      <w:proofErr w:type="spellStart"/>
+      <w:r>
+        <w:rPr>
+          <w:color w:val="BCBEC4"/>
+        </w:rPr>
+        <w:t>fabs</w:t>
+      </w:r>
+      <w:proofErr w:type="spellEnd"/>
+      <w:r>
+        <w:rPr>
+          <w:color w:val="BCBEC4"/>
+        </w:rPr>
+        <w:t>(sol</w:t>
+      </w:r>
+      <w:r>
+        <w:rPr>
+          <w:color w:val="5F8C8A"/>
+        </w:rPr>
+        <w:t>(</w:t>
+      </w:r>
+      <w:r>
+        <w:rPr>
+          <w:color w:val="2AACB8"/>
+        </w:rPr>
+        <w:t>2</w:t>
+      </w:r>
+      <w:r>
+        <w:rPr>
+          <w:color w:val="BCBEC4"/>
+        </w:rPr>
+        <w:t>,</w:t>
+      </w:r>
+      <w:r>
+        <w:rPr>
+          <w:color w:val="2AACB8"/>
+        </w:rPr>
+        <w:t>2</w:t>
+      </w:r>
+      <w:r>
+        <w:rPr>
+          <w:color w:val="5F8C8A"/>
+        </w:rPr>
+        <w:t>)</w:t>
+      </w:r>
+      <w:r>
+        <w:rPr>
+          <w:color w:val="BCBEC4"/>
+        </w:rPr>
+        <w:t>-</w:t>
+      </w:r>
+      <w:r>
+        <w:rPr>
+          <w:color w:val="2AACB8"/>
+        </w:rPr>
+        <w:t>1</w:t>
+      </w:r>
+      <w:r>
+        <w:rPr>
+          <w:color w:val="BCBEC4"/>
+        </w:rPr>
+        <w:t xml:space="preserve">)&lt;TOL2_ &amp;&amp; </w:t>
+      </w:r>
+      <w:proofErr w:type="spellStart"/>
+      <w:r>
+        <w:rPr>
+          <w:color w:val="BCBEC4"/>
+        </w:rPr>
+        <w:t>fabs</w:t>
+      </w:r>
+      <w:proofErr w:type="spellEnd"/>
+      <w:r>
+        <w:rPr>
+          <w:color w:val="BCBEC4"/>
+        </w:rPr>
+        <w:t>(sol</w:t>
+      </w:r>
+      <w:r>
+        <w:rPr>
+          <w:color w:val="5F8C8A"/>
+        </w:rPr>
+        <w:t>(</w:t>
+      </w:r>
+      <w:r>
+        <w:rPr>
+          <w:color w:val="2AACB8"/>
+        </w:rPr>
+        <w:t>2</w:t>
+      </w:r>
+      <w:r>
+        <w:rPr>
+          <w:color w:val="BCBEC4"/>
+        </w:rPr>
+        <w:t>,</w:t>
+      </w:r>
+      <w:r>
+        <w:rPr>
+          <w:color w:val="2AACB8"/>
+        </w:rPr>
+        <w:t>3</w:t>
+      </w:r>
+      <w:r>
+        <w:rPr>
+          <w:color w:val="5F8C8A"/>
+        </w:rPr>
+        <w:t>)</w:t>
+      </w:r>
+      <w:r>
+        <w:rPr>
+          <w:color w:val="BCBEC4"/>
+        </w:rPr>
+        <w:t>-</w:t>
+      </w:r>
+      <w:r>
+        <w:rPr>
+          <w:color w:val="2AACB8"/>
+        </w:rPr>
+        <w:t>0</w:t>
+      </w:r>
+      <w:r>
+        <w:rPr>
+          <w:color w:val="BCBEC4"/>
+        </w:rPr>
+        <w:t>&lt;TOL2_));</w:t>
+      </w:r>
+      <w:r>
+        <w:rPr>
+          <w:color w:val="BCBEC4"/>
+        </w:rPr>
+        <w:br/>
+      </w:r>
+      <w:r>
+        <w:rPr>
+          <w:color w:val="BCBEC4"/>
+        </w:rPr>
+        <w:lastRenderedPageBreak/>
+        <w:br/>
+        <w:t xml:space="preserve">    </w:t>
+      </w:r>
+      <w:r>
+        <w:rPr>
+          <w:color w:val="908B25"/>
+        </w:rPr>
+        <w:t>_</w:t>
+      </w:r>
+      <w:proofErr w:type="spellStart"/>
+      <w:r>
+        <w:rPr>
+          <w:color w:val="908B25"/>
+        </w:rPr>
+        <w:t>assert</w:t>
+      </w:r>
+      <w:proofErr w:type="spellEnd"/>
+      <w:r>
+        <w:rPr>
+          <w:color w:val="BCBEC4"/>
+        </w:rPr>
+        <w:t>(</w:t>
+      </w:r>
+      <w:proofErr w:type="spellStart"/>
+      <w:r>
+        <w:rPr>
+          <w:color w:val="BCBEC4"/>
+        </w:rPr>
+        <w:t>fabs</w:t>
+      </w:r>
+      <w:proofErr w:type="spellEnd"/>
+      <w:r>
+        <w:rPr>
+          <w:color w:val="BCBEC4"/>
+        </w:rPr>
+        <w:t>(sol</w:t>
+      </w:r>
+      <w:r>
+        <w:rPr>
+          <w:color w:val="5F8C8A"/>
+        </w:rPr>
+        <w:t>(</w:t>
+      </w:r>
+      <w:r>
+        <w:rPr>
+          <w:color w:val="2AACB8"/>
+        </w:rPr>
+        <w:t>3</w:t>
+      </w:r>
+      <w:r>
+        <w:rPr>
+          <w:color w:val="BCBEC4"/>
+        </w:rPr>
+        <w:t>,</w:t>
+      </w:r>
+      <w:r>
+        <w:rPr>
+          <w:color w:val="2AACB8"/>
+        </w:rPr>
+        <w:t>1</w:t>
+      </w:r>
+      <w:r>
+        <w:rPr>
+          <w:color w:val="5F8C8A"/>
+        </w:rPr>
+        <w:t>)</w:t>
+      </w:r>
+      <w:r>
+        <w:rPr>
+          <w:color w:val="BCBEC4"/>
+        </w:rPr>
+        <w:t>-</w:t>
+      </w:r>
+      <w:r>
+        <w:rPr>
+          <w:color w:val="2AACB8"/>
+        </w:rPr>
+        <w:t>0.841470984807897</w:t>
+      </w:r>
+      <w:r>
+        <w:rPr>
+          <w:color w:val="BCBEC4"/>
+        </w:rPr>
+        <w:t xml:space="preserve">)&lt;TOL2_ &amp;&amp; </w:t>
+      </w:r>
+      <w:proofErr w:type="spellStart"/>
+      <w:r>
+        <w:rPr>
+          <w:color w:val="BCBEC4"/>
+        </w:rPr>
+        <w:t>fabs</w:t>
+      </w:r>
+      <w:proofErr w:type="spellEnd"/>
+      <w:r>
+        <w:rPr>
+          <w:color w:val="BCBEC4"/>
+        </w:rPr>
+        <w:t>(sol</w:t>
+      </w:r>
+      <w:r>
+        <w:rPr>
+          <w:color w:val="5F8C8A"/>
+        </w:rPr>
+        <w:t>(</w:t>
+      </w:r>
+      <w:r>
+        <w:rPr>
+          <w:color w:val="2AACB8"/>
+        </w:rPr>
+        <w:t>3</w:t>
+      </w:r>
+      <w:r>
+        <w:rPr>
+          <w:color w:val="BCBEC4"/>
+        </w:rPr>
+        <w:t>,</w:t>
+      </w:r>
+      <w:r>
+        <w:rPr>
+          <w:color w:val="2AACB8"/>
+        </w:rPr>
+        <w:t>3</w:t>
+      </w:r>
+      <w:r>
+        <w:rPr>
+          <w:color w:val="5F8C8A"/>
+        </w:rPr>
+        <w:t>)</w:t>
+      </w:r>
+      <w:r>
+        <w:rPr>
+          <w:color w:val="BCBEC4"/>
+        </w:rPr>
+        <w:t>-</w:t>
+      </w:r>
+      <w:r>
+        <w:rPr>
+          <w:color w:val="2AACB8"/>
+        </w:rPr>
+        <w:t>0.54030230586814</w:t>
+      </w:r>
+      <w:r>
+        <w:rPr>
+          <w:color w:val="BCBEC4"/>
+        </w:rPr>
+        <w:t>)&lt;TOL2_);</w:t>
+      </w:r>
+      <w:r>
+        <w:rPr>
+          <w:color w:val="BCBEC4"/>
+        </w:rPr>
+        <w:br/>
+        <w:t xml:space="preserve">    </w:t>
+      </w:r>
+      <w:proofErr w:type="spellStart"/>
+      <w:r>
+        <w:rPr>
+          <w:color w:val="CF8E6D"/>
+        </w:rPr>
+        <w:t>return</w:t>
+      </w:r>
+      <w:proofErr w:type="spellEnd"/>
+      <w:r>
+        <w:rPr>
+          <w:color w:val="CF8E6D"/>
+        </w:rPr>
+        <w:t xml:space="preserve"> </w:t>
+      </w:r>
+      <w:r>
+        <w:rPr>
+          <w:color w:val="2AACB8"/>
+        </w:rPr>
+        <w:t>0</w:t>
+      </w:r>
+      <w:r>
+        <w:rPr>
+          <w:color w:val="BCBEC4"/>
+        </w:rPr>
+        <w:t>;</w:t>
+      </w:r>
+      <w:r>
+        <w:rPr>
+          <w:color w:val="BCBEC4"/>
+        </w:rPr>
+        <w:br/>
+      </w:r>
+      <w:r>
+        <w:rPr>
+          <w:color w:val="BCBEC4"/>
+        </w:rPr>
+        <w:br/>
+        <w:t>}</w:t>
+      </w:r>
+      <w:r>
+        <w:rPr>
+          <w:color w:val="BCBEC4"/>
+        </w:rPr>
+        <w:br/>
+      </w:r>
+      <w:proofErr w:type="spellStart"/>
+      <w:r>
+        <w:rPr>
+          <w:color w:val="CF8E6D"/>
+        </w:rPr>
+        <w:t>int</w:t>
+      </w:r>
+      <w:proofErr w:type="spellEnd"/>
+      <w:r>
+        <w:rPr>
+          <w:color w:val="CF8E6D"/>
+        </w:rPr>
+        <w:t xml:space="preserve"> </w:t>
+      </w:r>
+      <w:r>
+        <w:rPr>
+          <w:color w:val="56A8F5"/>
+        </w:rPr>
+        <w:t>R_z_01</w:t>
+      </w:r>
+      <w:r>
+        <w:rPr>
+          <w:color w:val="BCBEC4"/>
+        </w:rPr>
+        <w:t>(){</w:t>
+      </w:r>
+      <w:r>
+        <w:rPr>
+          <w:color w:val="BCBEC4"/>
+        </w:rPr>
+        <w:br/>
+        <w:t xml:space="preserve">    </w:t>
+      </w:r>
+      <w:proofErr w:type="spellStart"/>
+      <w:r>
+        <w:rPr>
+          <w:color w:val="CF8E6D"/>
+        </w:rPr>
+        <w:t>double</w:t>
+      </w:r>
+      <w:proofErr w:type="spellEnd"/>
+      <w:r>
+        <w:rPr>
+          <w:color w:val="CF8E6D"/>
+        </w:rPr>
+        <w:t xml:space="preserve"> </w:t>
+      </w:r>
+      <w:proofErr w:type="spellStart"/>
+      <w:r>
+        <w:rPr>
+          <w:color w:val="BCBEC4"/>
+        </w:rPr>
+        <w:t>alpha</w:t>
+      </w:r>
+      <w:proofErr w:type="spellEnd"/>
+      <w:r>
+        <w:rPr>
+          <w:color w:val="BCBEC4"/>
+        </w:rPr>
+        <w:t xml:space="preserve"> = </w:t>
+      </w:r>
+      <w:r>
+        <w:rPr>
+          <w:color w:val="2AACB8"/>
+        </w:rPr>
+        <w:t>1.0</w:t>
+      </w:r>
+      <w:r>
+        <w:rPr>
+          <w:color w:val="BCBEC4"/>
+        </w:rPr>
+        <w:t>;</w:t>
+      </w:r>
+      <w:r>
+        <w:rPr>
+          <w:color w:val="BCBEC4"/>
+        </w:rPr>
+        <w:br/>
+        <w:t xml:space="preserve">    </w:t>
+      </w:r>
+      <w:r>
+        <w:rPr>
+          <w:color w:val="B5B6E3"/>
+        </w:rPr>
+        <w:t xml:space="preserve">Matrix </w:t>
+      </w:r>
+      <w:r>
+        <w:rPr>
+          <w:color w:val="BCBEC4"/>
+        </w:rPr>
+        <w:t>sol(</w:t>
+      </w:r>
+      <w:r>
+        <w:rPr>
+          <w:color w:val="2AACB8"/>
+        </w:rPr>
+        <w:t>3</w:t>
+      </w:r>
+      <w:r>
+        <w:rPr>
+          <w:color w:val="BCBEC4"/>
+        </w:rPr>
+        <w:t>,</w:t>
+      </w:r>
+      <w:r>
+        <w:rPr>
+          <w:color w:val="2AACB8"/>
+        </w:rPr>
+        <w:t>3</w:t>
+      </w:r>
+      <w:r>
+        <w:rPr>
+          <w:color w:val="BCBEC4"/>
+        </w:rPr>
+        <w:t>);</w:t>
+      </w:r>
+      <w:r>
+        <w:rPr>
+          <w:color w:val="BCBEC4"/>
+        </w:rPr>
+        <w:br/>
+      </w:r>
+      <w:r>
+        <w:rPr>
+          <w:color w:val="BCBEC4"/>
+        </w:rPr>
+        <w:br/>
+        <w:t xml:space="preserve">    sol </w:t>
+      </w:r>
+      <w:r>
+        <w:rPr>
+          <w:color w:val="5F8C8A"/>
+        </w:rPr>
+        <w:t xml:space="preserve">= </w:t>
+      </w:r>
+      <w:proofErr w:type="spellStart"/>
+      <w:r>
+        <w:rPr>
+          <w:color w:val="BCBEC4"/>
+        </w:rPr>
+        <w:t>R_z</w:t>
+      </w:r>
+      <w:proofErr w:type="spellEnd"/>
+      <w:r>
+        <w:rPr>
+          <w:color w:val="BCBEC4"/>
+        </w:rPr>
+        <w:t>(</w:t>
+      </w:r>
+      <w:proofErr w:type="spellStart"/>
+      <w:r>
+        <w:rPr>
+          <w:color w:val="BCBEC4"/>
+        </w:rPr>
+        <w:t>alpha</w:t>
+      </w:r>
+      <w:proofErr w:type="spellEnd"/>
+      <w:r>
+        <w:rPr>
+          <w:color w:val="BCBEC4"/>
+        </w:rPr>
+        <w:t>);</w:t>
+      </w:r>
+      <w:r>
+        <w:rPr>
+          <w:color w:val="BCBEC4"/>
+        </w:rPr>
+        <w:br/>
+      </w:r>
+      <w:r>
+        <w:rPr>
+          <w:color w:val="BCBEC4"/>
+        </w:rPr>
+        <w:br/>
+        <w:t xml:space="preserve">    </w:t>
+      </w:r>
+      <w:r>
+        <w:rPr>
+          <w:color w:val="908B25"/>
+        </w:rPr>
+        <w:t>_</w:t>
+      </w:r>
+      <w:proofErr w:type="spellStart"/>
+      <w:r>
+        <w:rPr>
+          <w:color w:val="908B25"/>
+        </w:rPr>
+        <w:t>assert</w:t>
+      </w:r>
+      <w:proofErr w:type="spellEnd"/>
+      <w:r>
+        <w:rPr>
+          <w:color w:val="BCBEC4"/>
+        </w:rPr>
+        <w:t>(</w:t>
+      </w:r>
+      <w:proofErr w:type="spellStart"/>
+      <w:r>
+        <w:rPr>
+          <w:color w:val="BCBEC4"/>
+        </w:rPr>
+        <w:t>fabs</w:t>
+      </w:r>
+      <w:proofErr w:type="spellEnd"/>
+      <w:r>
+        <w:rPr>
+          <w:color w:val="BCBEC4"/>
+        </w:rPr>
+        <w:t>(sol</w:t>
+      </w:r>
+      <w:r>
+        <w:rPr>
+          <w:color w:val="5F8C8A"/>
+        </w:rPr>
+        <w:t>(</w:t>
+      </w:r>
+      <w:r>
+        <w:rPr>
+          <w:color w:val="2AACB8"/>
+        </w:rPr>
+        <w:t>1</w:t>
+      </w:r>
+      <w:r>
+        <w:rPr>
+          <w:color w:val="BCBEC4"/>
+        </w:rPr>
+        <w:t>,</w:t>
+      </w:r>
+      <w:r>
+        <w:rPr>
+          <w:color w:val="2AACB8"/>
+        </w:rPr>
+        <w:t>1</w:t>
+      </w:r>
+      <w:r>
+        <w:rPr>
+          <w:color w:val="5F8C8A"/>
+        </w:rPr>
+        <w:t xml:space="preserve">) </w:t>
+      </w:r>
+      <w:r>
+        <w:rPr>
+          <w:color w:val="BCBEC4"/>
+        </w:rPr>
+        <w:t xml:space="preserve">- </w:t>
+      </w:r>
+      <w:r>
+        <w:rPr>
+          <w:color w:val="2AACB8"/>
+        </w:rPr>
+        <w:t>0.54030230586814</w:t>
+      </w:r>
+      <w:r>
+        <w:rPr>
+          <w:color w:val="BCBEC4"/>
+        </w:rPr>
+        <w:t xml:space="preserve">) &lt; TOL2_ &amp;&amp; </w:t>
+      </w:r>
+      <w:proofErr w:type="spellStart"/>
+      <w:r>
+        <w:rPr>
+          <w:color w:val="BCBEC4"/>
+        </w:rPr>
+        <w:t>fabs</w:t>
+      </w:r>
+      <w:proofErr w:type="spellEnd"/>
+      <w:r>
+        <w:rPr>
+          <w:color w:val="BCBEC4"/>
+        </w:rPr>
+        <w:t>(sol</w:t>
+      </w:r>
+      <w:r>
+        <w:rPr>
+          <w:color w:val="5F8C8A"/>
+        </w:rPr>
+        <w:t>(</w:t>
+      </w:r>
+      <w:r>
+        <w:rPr>
+          <w:color w:val="2AACB8"/>
+        </w:rPr>
+        <w:t>1</w:t>
+      </w:r>
+      <w:r>
+        <w:rPr>
+          <w:color w:val="BCBEC4"/>
+        </w:rPr>
+        <w:t>,</w:t>
+      </w:r>
+      <w:r>
+        <w:rPr>
+          <w:color w:val="2AACB8"/>
+        </w:rPr>
+        <w:t>2</w:t>
+      </w:r>
+      <w:r>
+        <w:rPr>
+          <w:color w:val="5F8C8A"/>
+        </w:rPr>
+        <w:t xml:space="preserve">) </w:t>
+      </w:r>
+      <w:r>
+        <w:rPr>
+          <w:color w:val="BCBEC4"/>
+        </w:rPr>
+        <w:t xml:space="preserve">- </w:t>
+      </w:r>
+      <w:r>
+        <w:rPr>
+          <w:color w:val="2AACB8"/>
+        </w:rPr>
+        <w:t>0.841470984807897</w:t>
+      </w:r>
+      <w:r>
+        <w:rPr>
+          <w:color w:val="BCBEC4"/>
+        </w:rPr>
+        <w:t>) &lt; TOL2_);</w:t>
+      </w:r>
+      <w:r>
+        <w:rPr>
+          <w:color w:val="BCBEC4"/>
+        </w:rPr>
+        <w:br/>
+      </w:r>
+      <w:r>
+        <w:rPr>
+          <w:color w:val="BCBEC4"/>
+        </w:rPr>
+        <w:br/>
+        <w:t xml:space="preserve">    </w:t>
+      </w:r>
+      <w:r>
+        <w:rPr>
+          <w:color w:val="908B25"/>
+        </w:rPr>
+        <w:t>_</w:t>
+      </w:r>
+      <w:proofErr w:type="spellStart"/>
+      <w:r>
+        <w:rPr>
+          <w:color w:val="908B25"/>
+        </w:rPr>
+        <w:t>assert</w:t>
+      </w:r>
+      <w:proofErr w:type="spellEnd"/>
+      <w:r>
+        <w:rPr>
+          <w:color w:val="BCBEC4"/>
+        </w:rPr>
+        <w:t>(</w:t>
+      </w:r>
+      <w:proofErr w:type="spellStart"/>
+      <w:r>
+        <w:rPr>
+          <w:color w:val="BCBEC4"/>
+        </w:rPr>
+        <w:t>fabs</w:t>
+      </w:r>
+      <w:proofErr w:type="spellEnd"/>
+      <w:r>
+        <w:rPr>
+          <w:color w:val="BCBEC4"/>
+        </w:rPr>
+        <w:t>(sol</w:t>
+      </w:r>
+      <w:r>
+        <w:rPr>
+          <w:color w:val="5F8C8A"/>
+        </w:rPr>
+        <w:t>(</w:t>
+      </w:r>
+      <w:r>
+        <w:rPr>
+          <w:color w:val="2AACB8"/>
+        </w:rPr>
+        <w:t>2</w:t>
+      </w:r>
+      <w:r>
+        <w:rPr>
+          <w:color w:val="BCBEC4"/>
+        </w:rPr>
+        <w:t>,</w:t>
+      </w:r>
+      <w:r>
+        <w:rPr>
+          <w:color w:val="2AACB8"/>
+        </w:rPr>
+        <w:t>1</w:t>
+      </w:r>
+      <w:r>
+        <w:rPr>
+          <w:color w:val="5F8C8A"/>
+        </w:rPr>
+        <w:t>)</w:t>
+      </w:r>
+      <w:r>
+        <w:rPr>
+          <w:color w:val="BCBEC4"/>
+        </w:rPr>
+        <w:t>+</w:t>
+      </w:r>
+      <w:r>
+        <w:rPr>
+          <w:color w:val="2AACB8"/>
+        </w:rPr>
+        <w:t>0.841470984807897</w:t>
+      </w:r>
+      <w:r>
+        <w:rPr>
+          <w:color w:val="BCBEC4"/>
+        </w:rPr>
+        <w:t xml:space="preserve">&lt;TOL2_) &amp;&amp; </w:t>
+      </w:r>
+      <w:proofErr w:type="spellStart"/>
+      <w:r>
+        <w:rPr>
+          <w:color w:val="BCBEC4"/>
+        </w:rPr>
+        <w:t>fabs</w:t>
+      </w:r>
+      <w:proofErr w:type="spellEnd"/>
+      <w:r>
+        <w:rPr>
+          <w:color w:val="BCBEC4"/>
+        </w:rPr>
+        <w:t>(sol</w:t>
+      </w:r>
+      <w:r>
+        <w:rPr>
+          <w:color w:val="5F8C8A"/>
+        </w:rPr>
+        <w:t>(</w:t>
+      </w:r>
+      <w:r>
+        <w:rPr>
+          <w:color w:val="2AACB8"/>
+        </w:rPr>
+        <w:t>2</w:t>
+      </w:r>
+      <w:r>
+        <w:rPr>
+          <w:color w:val="BCBEC4"/>
+        </w:rPr>
+        <w:t>,</w:t>
+      </w:r>
+      <w:r>
+        <w:rPr>
+          <w:color w:val="2AACB8"/>
+        </w:rPr>
+        <w:t>2</w:t>
+      </w:r>
+      <w:r>
+        <w:rPr>
+          <w:color w:val="5F8C8A"/>
+        </w:rPr>
+        <w:t>)</w:t>
+      </w:r>
+      <w:r>
+        <w:rPr>
+          <w:color w:val="BCBEC4"/>
+        </w:rPr>
+        <w:t>-</w:t>
+      </w:r>
+      <w:r>
+        <w:rPr>
+          <w:color w:val="2AACB8"/>
+        </w:rPr>
+        <w:t>0.54030230586814</w:t>
+      </w:r>
+      <w:r>
+        <w:rPr>
+          <w:color w:val="BCBEC4"/>
+        </w:rPr>
+        <w:t xml:space="preserve">)&lt;TOL2_ &amp;&amp; </w:t>
+      </w:r>
+      <w:proofErr w:type="spellStart"/>
+      <w:r>
+        <w:rPr>
+          <w:color w:val="BCBEC4"/>
+        </w:rPr>
+        <w:t>fabs</w:t>
+      </w:r>
+      <w:proofErr w:type="spellEnd"/>
+      <w:r>
+        <w:rPr>
+          <w:color w:val="BCBEC4"/>
+        </w:rPr>
+        <w:t>(sol</w:t>
+      </w:r>
+      <w:r>
+        <w:rPr>
+          <w:color w:val="5F8C8A"/>
+        </w:rPr>
+        <w:t>(</w:t>
+      </w:r>
+      <w:r>
+        <w:rPr>
+          <w:color w:val="2AACB8"/>
+        </w:rPr>
+        <w:t>2</w:t>
+      </w:r>
+      <w:r>
+        <w:rPr>
+          <w:color w:val="BCBEC4"/>
+        </w:rPr>
+        <w:t>,</w:t>
+      </w:r>
+      <w:r>
+        <w:rPr>
+          <w:color w:val="2AACB8"/>
+        </w:rPr>
+        <w:t>3</w:t>
+      </w:r>
+      <w:r>
+        <w:rPr>
+          <w:color w:val="5F8C8A"/>
+        </w:rPr>
+        <w:t>)</w:t>
+      </w:r>
+      <w:r>
+        <w:rPr>
+          <w:color w:val="BCBEC4"/>
+        </w:rPr>
+        <w:t>-</w:t>
+      </w:r>
+      <w:r>
+        <w:rPr>
+          <w:color w:val="2AACB8"/>
+        </w:rPr>
+        <w:t>0</w:t>
+      </w:r>
+      <w:r>
+        <w:rPr>
+          <w:color w:val="BCBEC4"/>
+        </w:rPr>
+        <w:t>&lt;TOL2_));</w:t>
+      </w:r>
+      <w:r>
+        <w:rPr>
+          <w:color w:val="BCBEC4"/>
+        </w:rPr>
+        <w:br/>
+      </w:r>
+      <w:r>
+        <w:rPr>
+          <w:color w:val="BCBEC4"/>
+        </w:rPr>
+        <w:br/>
+        <w:t xml:space="preserve">    </w:t>
+      </w:r>
+      <w:r>
+        <w:rPr>
+          <w:color w:val="908B25"/>
+        </w:rPr>
+        <w:t>_</w:t>
+      </w:r>
+      <w:proofErr w:type="spellStart"/>
+      <w:r>
+        <w:rPr>
+          <w:color w:val="908B25"/>
+        </w:rPr>
+        <w:t>assert</w:t>
+      </w:r>
+      <w:proofErr w:type="spellEnd"/>
+      <w:r>
+        <w:rPr>
+          <w:color w:val="BCBEC4"/>
+        </w:rPr>
+        <w:t>(</w:t>
+      </w:r>
+      <w:proofErr w:type="spellStart"/>
+      <w:r>
+        <w:rPr>
+          <w:color w:val="BCBEC4"/>
+        </w:rPr>
+        <w:t>fabs</w:t>
+      </w:r>
+      <w:proofErr w:type="spellEnd"/>
+      <w:r>
+        <w:rPr>
+          <w:color w:val="BCBEC4"/>
+        </w:rPr>
+        <w:t>(sol</w:t>
+      </w:r>
+      <w:r>
+        <w:rPr>
+          <w:color w:val="5F8C8A"/>
+        </w:rPr>
+        <w:t>(</w:t>
+      </w:r>
+      <w:r>
+        <w:rPr>
+          <w:color w:val="2AACB8"/>
+        </w:rPr>
+        <w:t>3</w:t>
+      </w:r>
+      <w:r>
+        <w:rPr>
+          <w:color w:val="BCBEC4"/>
+        </w:rPr>
+        <w:t>,</w:t>
+      </w:r>
+      <w:r>
+        <w:rPr>
+          <w:color w:val="2AACB8"/>
+        </w:rPr>
+        <w:t>1</w:t>
+      </w:r>
+      <w:r>
+        <w:rPr>
+          <w:color w:val="5F8C8A"/>
+        </w:rPr>
+        <w:t>)</w:t>
+      </w:r>
+      <w:r>
+        <w:rPr>
+          <w:color w:val="BCBEC4"/>
+        </w:rPr>
+        <w:t>-</w:t>
+      </w:r>
+      <w:r>
+        <w:rPr>
+          <w:color w:val="2AACB8"/>
+        </w:rPr>
+        <w:t>0</w:t>
+      </w:r>
+      <w:r>
+        <w:rPr>
+          <w:color w:val="BCBEC4"/>
+        </w:rPr>
+        <w:t xml:space="preserve">)&lt;TOL2_ &amp;&amp; </w:t>
+      </w:r>
+      <w:proofErr w:type="spellStart"/>
+      <w:r>
+        <w:rPr>
+          <w:color w:val="BCBEC4"/>
+        </w:rPr>
+        <w:t>fabs</w:t>
+      </w:r>
+      <w:proofErr w:type="spellEnd"/>
+      <w:r>
+        <w:rPr>
+          <w:color w:val="BCBEC4"/>
+        </w:rPr>
+        <w:t>(sol</w:t>
+      </w:r>
+      <w:r>
+        <w:rPr>
+          <w:color w:val="5F8C8A"/>
+        </w:rPr>
+        <w:t>(</w:t>
+      </w:r>
+      <w:r>
+        <w:rPr>
+          <w:color w:val="2AACB8"/>
+        </w:rPr>
+        <w:t>3</w:t>
+      </w:r>
+      <w:r>
+        <w:rPr>
+          <w:color w:val="BCBEC4"/>
+        </w:rPr>
+        <w:t>,</w:t>
+      </w:r>
+      <w:r>
+        <w:rPr>
+          <w:color w:val="2AACB8"/>
+        </w:rPr>
+        <w:t>3</w:t>
+      </w:r>
+      <w:r>
+        <w:rPr>
+          <w:color w:val="5F8C8A"/>
+        </w:rPr>
+        <w:t>)</w:t>
+      </w:r>
+      <w:r>
+        <w:rPr>
+          <w:color w:val="BCBEC4"/>
+        </w:rPr>
+        <w:t>-</w:t>
+      </w:r>
+      <w:r>
+        <w:rPr>
+          <w:color w:val="2AACB8"/>
+        </w:rPr>
+        <w:t>1</w:t>
+      </w:r>
+      <w:r>
+        <w:rPr>
+          <w:color w:val="BCBEC4"/>
+        </w:rPr>
+        <w:t>)&lt;TOL2_);</w:t>
+      </w:r>
+      <w:r>
+        <w:rPr>
+          <w:color w:val="BCBEC4"/>
+        </w:rPr>
+        <w:br/>
+        <w:t xml:space="preserve">    </w:t>
+      </w:r>
+      <w:proofErr w:type="spellStart"/>
+      <w:r>
+        <w:rPr>
+          <w:color w:val="CF8E6D"/>
+        </w:rPr>
+        <w:t>return</w:t>
+      </w:r>
+      <w:proofErr w:type="spellEnd"/>
+      <w:r>
+        <w:rPr>
+          <w:color w:val="CF8E6D"/>
+        </w:rPr>
+        <w:t xml:space="preserve"> </w:t>
+      </w:r>
+      <w:r>
+        <w:rPr>
+          <w:color w:val="2AACB8"/>
+        </w:rPr>
+        <w:t>0</w:t>
+      </w:r>
+      <w:r>
+        <w:rPr>
+          <w:color w:val="BCBEC4"/>
+        </w:rPr>
+        <w:t>;</w:t>
+      </w:r>
+      <w:r>
+        <w:rPr>
+          <w:color w:val="BCBEC4"/>
+        </w:rPr>
+        <w:br/>
+      </w:r>
+      <w:r>
+        <w:rPr>
+          <w:color w:val="BCBEC4"/>
+        </w:rPr>
+        <w:br/>
+        <w:t>}</w:t>
+      </w:r>
+    </w:p>
+    <w:p>
+      <w:pPr>
+        <w:pStyle w:val="HTMLconformatoprevio"/>
+        <w:shd w:val="clear" w:color="auto" w:fill="1E1F22"/>
+        <w:rPr>
+          <w:color w:val="BCBEC4"/>
+        </w:rPr>
+      </w:pPr>
+    </w:p>
+    <w:p>
+      <w:pPr>
+        <w:kinsoku w:val="0"/>
+        <w:overflowPunct w:val="0"/>
+        <w:rPr>
+          <w:sz w:val="24"/>
+          <w:szCs w:val="24"/>
+        </w:rPr>
+      </w:pPr>
+      <w:r>
+        <w:rPr>
+          <w:sz w:val="24"/>
+          <w:szCs w:val="24"/>
+        </w:rPr>
+        <w:t xml:space="preserve">Los </w:t>
+      </w:r>
+      <w:proofErr w:type="spellStart"/>
+      <w:r>
+        <w:rPr>
+          <w:sz w:val="24"/>
+          <w:szCs w:val="24"/>
+        </w:rPr>
+        <w:t>tests</w:t>
+      </w:r>
+      <w:proofErr w:type="spellEnd"/>
+      <w:r>
+        <w:rPr>
+          <w:sz w:val="24"/>
+          <w:szCs w:val="24"/>
+        </w:rPr>
+        <w:t xml:space="preserve"> no dieron problemas ya que la implementación de las funciones </w:t>
+      </w:r>
+      <w:proofErr w:type="spellStart"/>
+      <w:r>
+        <w:rPr>
+          <w:sz w:val="24"/>
+          <w:szCs w:val="24"/>
+        </w:rPr>
+        <w:t>R_x</w:t>
+      </w:r>
+      <w:proofErr w:type="spellEnd"/>
+      <w:r>
+        <w:rPr>
+          <w:sz w:val="24"/>
+          <w:szCs w:val="24"/>
+        </w:rPr>
+        <w:t xml:space="preserve">, </w:t>
+      </w:r>
+      <w:proofErr w:type="spellStart"/>
+      <w:r>
+        <w:rPr>
+          <w:sz w:val="24"/>
+          <w:szCs w:val="24"/>
+        </w:rPr>
+        <w:t>R_y</w:t>
+      </w:r>
+      <w:proofErr w:type="spellEnd"/>
+      <w:r>
+        <w:rPr>
+          <w:sz w:val="24"/>
+          <w:szCs w:val="24"/>
+        </w:rPr>
+        <w:t xml:space="preserve"> y </w:t>
+      </w:r>
+      <w:proofErr w:type="spellStart"/>
+      <w:r>
+        <w:rPr>
+          <w:sz w:val="24"/>
+          <w:szCs w:val="24"/>
+        </w:rPr>
+        <w:t>R_z</w:t>
+      </w:r>
+      <w:proofErr w:type="spellEnd"/>
+      <w:r>
+        <w:rPr>
+          <w:sz w:val="24"/>
+          <w:szCs w:val="24"/>
+        </w:rPr>
+        <w:t xml:space="preserve"> son muy similares entre sí y no requieren muchos cambios de código. El test de </w:t>
+      </w:r>
+      <w:proofErr w:type="spellStart"/>
+      <w:r>
+        <w:rPr>
+          <w:sz w:val="24"/>
+          <w:szCs w:val="24"/>
+        </w:rPr>
+        <w:t>R_x</w:t>
+      </w:r>
+      <w:proofErr w:type="spellEnd"/>
+      <w:r>
+        <w:rPr>
+          <w:sz w:val="24"/>
+          <w:szCs w:val="24"/>
+        </w:rPr>
+        <w:t xml:space="preserve"> nos lo dio el profesor en clase y los </w:t>
+      </w:r>
+      <w:proofErr w:type="spellStart"/>
+      <w:r>
+        <w:rPr>
+          <w:sz w:val="24"/>
+          <w:szCs w:val="24"/>
+        </w:rPr>
+        <w:t>tests</w:t>
+      </w:r>
+      <w:proofErr w:type="spellEnd"/>
+      <w:r>
+        <w:rPr>
+          <w:sz w:val="24"/>
+          <w:szCs w:val="24"/>
+        </w:rPr>
+        <w:t xml:space="preserve"> de </w:t>
+      </w:r>
+      <w:proofErr w:type="spellStart"/>
+      <w:r>
+        <w:rPr>
+          <w:sz w:val="24"/>
+          <w:szCs w:val="24"/>
+        </w:rPr>
+        <w:t>R_y</w:t>
+      </w:r>
+      <w:proofErr w:type="spellEnd"/>
+      <w:r>
+        <w:rPr>
+          <w:sz w:val="24"/>
+          <w:szCs w:val="24"/>
+        </w:rPr>
+        <w:t xml:space="preserve"> y </w:t>
+      </w:r>
+      <w:proofErr w:type="spellStart"/>
+      <w:r>
+        <w:rPr>
+          <w:sz w:val="24"/>
+          <w:szCs w:val="24"/>
+        </w:rPr>
+        <w:t>R_z</w:t>
+      </w:r>
+      <w:proofErr w:type="spellEnd"/>
+      <w:r>
+        <w:rPr>
+          <w:sz w:val="24"/>
+          <w:szCs w:val="24"/>
+        </w:rPr>
+        <w:t xml:space="preserve"> son copias del test de </w:t>
+      </w:r>
+      <w:proofErr w:type="spellStart"/>
+      <w:r>
+        <w:rPr>
+          <w:sz w:val="24"/>
+          <w:szCs w:val="24"/>
+        </w:rPr>
+        <w:t>R_x</w:t>
+      </w:r>
+      <w:proofErr w:type="spellEnd"/>
+      <w:r>
+        <w:rPr>
+          <w:sz w:val="24"/>
+          <w:szCs w:val="24"/>
+        </w:rPr>
+        <w:t xml:space="preserve"> con los valores tomados de las pruebas en </w:t>
+      </w:r>
+      <w:proofErr w:type="spellStart"/>
+      <w:r>
+        <w:rPr>
+          <w:sz w:val="24"/>
+          <w:szCs w:val="24"/>
+        </w:rPr>
+        <w:t>MatLab</w:t>
+      </w:r>
+      <w:proofErr w:type="spellEnd"/>
+      <w:r>
+        <w:rPr>
+          <w:sz w:val="24"/>
+          <w:szCs w:val="24"/>
+        </w:rPr>
+        <w:t>.</w:t>
+      </w:r>
+    </w:p>
+    <w:p>
+      <w:pPr>
+        <w:kinsoku w:val="0"/>
+        <w:overflowPunct w:val="0"/>
+        <w:rPr>
+          <w:sz w:val="24"/>
+          <w:szCs w:val="24"/>
         </w:rPr>
       </w:pPr>
     </w:p>
@@ -8748,6 +12223,54 @@
       <w:szCs w:val="24"/>
     </w:rPr>
   </w:style>
+  <w:style w:type="paragraph" w:styleId="HTMLconformatoprevio">
+    <w:name w:val="HTML Preformatted"/>
+    <w:basedOn w:val="Normal"/>
+    <w:link w:val="HTMLconformatoprevioCar"/>
+    <w:uiPriority w:val="99"/>
+    <w:unhideWhenUsed/>
+    <w:rsid w:val="00D05ABE"/>
+    <w:pPr>
+      <w:tabs>
+        <w:tab w:val="left" w:pos="916"/>
+        <w:tab w:val="left" w:pos="1832"/>
+        <w:tab w:val="left" w:pos="2748"/>
+        <w:tab w:val="left" w:pos="3664"/>
+        <w:tab w:val="left" w:pos="4580"/>
+        <w:tab w:val="left" w:pos="5496"/>
+        <w:tab w:val="left" w:pos="6412"/>
+        <w:tab w:val="left" w:pos="7328"/>
+        <w:tab w:val="left" w:pos="8244"/>
+        <w:tab w:val="left" w:pos="9160"/>
+        <w:tab w:val="left" w:pos="10076"/>
+        <w:tab w:val="left" w:pos="10992"/>
+        <w:tab w:val="left" w:pos="11908"/>
+        <w:tab w:val="left" w:pos="12824"/>
+        <w:tab w:val="left" w:pos="13740"/>
+        <w:tab w:val="left" w:pos="14656"/>
+      </w:tabs>
+      <w:spacing w:after="0" w:line="240" w:lineRule="auto"/>
+    </w:pPr>
+    <w:rPr>
+      <w:rFonts w:ascii="Courier New" w:eastAsia="Times New Roman" w:hAnsi="Courier New" w:cs="Courier New"/>
+      <w:sz w:val="20"/>
+      <w:szCs w:val="20"/>
+      <w:lang w:eastAsia="es-ES"/>
+    </w:rPr>
+  </w:style>
+  <w:style w:type="character" w:customStyle="1" w:styleId="HTMLconformatoprevioCar">
+    <w:name w:val="HTML con formato previo Car"/>
+    <w:basedOn w:val="Fuentedeprrafopredeter"/>
+    <w:link w:val="HTMLconformatoprevio"/>
+    <w:uiPriority w:val="99"/>
+    <w:rsid w:val="00D05ABE"/>
+    <w:rPr>
+      <w:rFonts w:ascii="Courier New" w:eastAsia="Times New Roman" w:hAnsi="Courier New" w:cs="Courier New"/>
+      <w:sz w:val="20"/>
+      <w:szCs w:val="20"/>
+      <w:lang w:eastAsia="es-ES"/>
+    </w:rPr>
+  </w:style>
 </w:styles>
 </file>
 

</xml_diff>

<commit_message>
accelpointmass ires (a medias) meanobliquity
</commit_message>
<xml_diff>
--- a/Seguimiento.docx
+++ b/Seguimiento.docx
@@ -1,6 +1,6 @@
 
 <file path=word/document.xml><?xml version="1.0" encoding="utf-8"?>
-<w:document xmlns:wpc="http://schemas.microsoft.com/office/word/2010/wordprocessingCanvas" xmlns:cx="http://schemas.microsoft.com/office/drawing/2014/chartex" xmlns:cx1="http://schemas.microsoft.com/office/drawing/2015/9/8/chartex" xmlns:cx2="http://schemas.microsoft.com/office/drawing/2015/10/21/chartex" xmlns:cx3="http://schemas.microsoft.com/office/drawing/2016/5/9/chartex" xmlns:cx4="http://schemas.microsoft.com/office/drawing/2016/5/10/chartex" xmlns:cx5="http://schemas.microsoft.com/office/drawing/2016/5/11/chartex" xmlns:cx6="http://schemas.microsoft.com/office/drawing/2016/5/12/chartex" xmlns:cx7="http://schemas.microsoft.com/office/drawing/2016/5/13/chartex" xmlns:cx8="http://schemas.microsoft.com/office/drawing/2016/5/14/chartex" xmlns:mc="http://schemas.openxmlformats.org/markup-compatibility/2006" xmlns:aink="http://schemas.microsoft.com/office/drawing/2016/ink" xmlns:am3d="http://schemas.microsoft.com/office/drawing/2017/model3d" xmlns:o="urn:schemas-microsoft-com:office:office" xmlns:oel="http://schemas.microsoft.com/office/2019/extlst" xmlns:r="http://schemas.openxmlformats.org/officeDocument/2006/relationships" xmlns:m="http://schemas.openxmlformats.org/officeDocument/2006/math" xmlns:v="urn:schemas-microsoft-com:vml" xmlns:wp14="http://schemas.microsoft.com/office/word/2010/wordprocessingDrawing" xmlns:wp="http://schemas.openxmlformats.org/drawingml/2006/wordprocessingDrawing" xmlns:w10="urn:schemas-microsoft-com:office:word" xmlns:w="http://schemas.openxmlformats.org/wordprocessingml/2006/main" xmlns:w14="http://schemas.microsoft.com/office/word/2010/wordml" xmlns:w15="http://schemas.microsoft.com/office/word/2012/wordml" xmlns:w16cex="http://schemas.microsoft.com/office/word/2018/wordml/cex" xmlns:w16cid="http://schemas.microsoft.com/office/word/2016/wordml/cid" xmlns:w16="http://schemas.microsoft.com/office/word/2018/wordml" xmlns:w16du="http://schemas.microsoft.com/office/word/2023/wordml/word16du" xmlns:w16sdtdh="http://schemas.microsoft.com/office/word/2020/wordml/sdtdatahash" xmlns:w16sdtfl="http://schemas.microsoft.com/office/word/2024/wordml/sdtformatlock" xmlns:w16se="http://schemas.microsoft.com/office/word/2015/wordml/symex" xmlns:wpg="http://schemas.microsoft.com/office/word/2010/wordprocessingGroup" xmlns:wpi="http://schemas.microsoft.com/office/word/2010/wordprocessingInk" xmlns:wne="http://schemas.microsoft.com/office/word/2006/wordml" xmlns:wps="http://schemas.microsoft.com/office/word/2010/wordprocessingShape" mc:Ignorable="w14 w15 w16se w16cid w16 w16cex w16sdtdh w16sdtfl w16du wp14">
+<w:document xmlns:wpc="http://schemas.microsoft.com/office/word/2010/wordprocessingCanvas" xmlns:cx="http://schemas.microsoft.com/office/drawing/2014/chartex" xmlns:cx1="http://schemas.microsoft.com/office/drawing/2015/9/8/chartex" xmlns:cx2="http://schemas.microsoft.com/office/drawing/2015/10/21/chartex" xmlns:cx3="http://schemas.microsoft.com/office/drawing/2016/5/9/chartex" xmlns:cx4="http://schemas.microsoft.com/office/drawing/2016/5/10/chartex" xmlns:cx5="http://schemas.microsoft.com/office/drawing/2016/5/11/chartex" xmlns:cx6="http://schemas.microsoft.com/office/drawing/2016/5/12/chartex" xmlns:cx7="http://schemas.microsoft.com/office/drawing/2016/5/13/chartex" xmlns:cx8="http://schemas.microsoft.com/office/drawing/2016/5/14/chartex" xmlns:mc="http://schemas.openxmlformats.org/markup-compatibility/2006" xmlns:aink="http://schemas.microsoft.com/office/drawing/2016/ink" xmlns:am3d="http://schemas.microsoft.com/office/drawing/2017/model3d" xmlns:o="urn:schemas-microsoft-com:office:office" xmlns:r="http://schemas.openxmlformats.org/officeDocument/2006/relationships" xmlns:m="http://schemas.openxmlformats.org/officeDocument/2006/math" xmlns:v="urn:schemas-microsoft-com:vml" xmlns:wp14="http://schemas.microsoft.com/office/word/2010/wordprocessingDrawing" xmlns:wp="http://schemas.openxmlformats.org/drawingml/2006/wordprocessingDrawing" xmlns:w10="urn:schemas-microsoft-com:office:word" xmlns:w="http://schemas.openxmlformats.org/wordprocessingml/2006/main" xmlns:w14="http://schemas.microsoft.com/office/word/2010/wordml" xmlns:w15="http://schemas.microsoft.com/office/word/2012/wordml" xmlns:w16cex="http://schemas.microsoft.com/office/word/2018/wordml/cex" xmlns:w16cid="http://schemas.microsoft.com/office/word/2016/wordml/cid" xmlns:w16="http://schemas.microsoft.com/office/word/2018/wordml" xmlns:w16sdtdh="http://schemas.microsoft.com/office/word/2020/wordml/sdtdatahash" xmlns:w16se="http://schemas.microsoft.com/office/word/2015/wordml/symex" xmlns:wpg="http://schemas.microsoft.com/office/word/2010/wordprocessingGroup" xmlns:wpi="http://schemas.microsoft.com/office/word/2010/wordprocessingInk" xmlns:wne="http://schemas.microsoft.com/office/word/2006/wordml" xmlns:wps="http://schemas.microsoft.com/office/word/2010/wordprocessingShape" mc:Ignorable="w14 w15 w16se w16cid w16 w16cex w16sdtdh wp14">
   <w:body>
     <w:p>
       <w:pPr>
@@ -139,6 +139,7 @@
         <w:rPr>
           <w:rFonts w:ascii="Arial" w:hAnsi="Arial"/>
           <w:color w:val="FF0000"/>
+          <w:highlight w:val="green"/>
         </w:rPr>
       </w:pPr>
       <w:proofErr w:type="spellStart"/>
@@ -147,6 +148,7 @@
           <w:rStyle w:val="normaltextrun"/>
           <w:rFonts w:ascii="Arial" w:hAnsi="Arial"/>
           <w:color w:val="FF0000"/>
+          <w:highlight w:val="green"/>
         </w:rPr>
         <w:t>AccelPointMass.m</w:t>
       </w:r>
@@ -156,6 +158,7 @@
           <w:rStyle w:val="eop"/>
           <w:rFonts w:ascii="Arial" w:hAnsi="Arial"/>
           <w:color w:val="FF0000"/>
+          <w:highlight w:val="green"/>
         </w:rPr>
         <w:t> </w:t>
       </w:r>
@@ -774,6 +777,7 @@
         <w:rPr>
           <w:rFonts w:ascii="Arial" w:hAnsi="Arial"/>
           <w:color w:val="FF0000"/>
+          <w:highlight w:val="green"/>
         </w:rPr>
       </w:pPr>
       <w:proofErr w:type="spellStart"/>
@@ -782,6 +786,7 @@
           <w:rStyle w:val="normaltextrun"/>
           <w:rFonts w:ascii="Arial" w:hAnsi="Arial"/>
           <w:color w:val="FF0000"/>
+          <w:highlight w:val="green"/>
         </w:rPr>
         <w:t>IERS.m</w:t>
       </w:r>
@@ -791,6 +796,7 @@
           <w:rStyle w:val="eop"/>
           <w:rFonts w:ascii="Arial" w:hAnsi="Arial"/>
           <w:color w:val="FF0000"/>
+          <w:highlight w:val="green"/>
         </w:rPr>
         <w:t> </w:t>
       </w:r>
@@ -901,6 +907,7 @@
         <w:rPr>
           <w:rFonts w:ascii="Arial" w:hAnsi="Arial"/>
           <w:color w:val="FF0000"/>
+          <w:highlight w:val="green"/>
         </w:rPr>
       </w:pPr>
       <w:proofErr w:type="spellStart"/>
@@ -909,6 +916,7 @@
           <w:rStyle w:val="normaltextrun"/>
           <w:rFonts w:ascii="Arial" w:hAnsi="Arial"/>
           <w:color w:val="FF0000"/>
+          <w:highlight w:val="green"/>
         </w:rPr>
         <w:t>MeanObliquity.m</w:t>
       </w:r>
@@ -918,6 +926,7 @@
           <w:rStyle w:val="eop"/>
           <w:rFonts w:ascii="Arial" w:hAnsi="Arial"/>
           <w:color w:val="FF0000"/>
+          <w:highlight w:val="green"/>
         </w:rPr>
         <w:t> </w:t>
       </w:r>
@@ -1790,7 +1799,6 @@
         <w:t>_</w:t>
       </w:r>
       <w:proofErr w:type="spellStart"/>
-      <w:proofErr w:type="gramStart"/>
       <w:r>
         <w:rPr>
           <w:color w:val="908B25"/>
@@ -1832,7 +1840,6 @@
         </w:rPr>
         <w:t>(</w:t>
       </w:r>
-      <w:proofErr w:type="gramEnd"/>
       <w:r>
         <w:rPr>
           <w:color w:val="2AACB8"/>
@@ -1906,7 +1913,6 @@
         <w:t xml:space="preserve">) - </w:t>
       </w:r>
       <w:proofErr w:type="spellStart"/>
-      <w:proofErr w:type="gramStart"/>
       <w:r>
         <w:rPr>
           <w:color w:val="BCBEC4"/>
@@ -1920,7 +1926,6 @@
         </w:rPr>
         <w:t>(</w:t>
       </w:r>
-      <w:proofErr w:type="gramEnd"/>
       <w:r>
         <w:rPr>
           <w:color w:val="2AACB8"/>
@@ -2116,7 +2121,6 @@
         <w:t xml:space="preserve">x = </w:t>
       </w:r>
       <w:proofErr w:type="spellStart"/>
-      <w:proofErr w:type="gramStart"/>
       <w:r>
         <w:rPr>
           <w:rFonts w:ascii="Courier New" w:eastAsia="Times New Roman" w:hAnsi="Courier New" w:cs="Courier New"/>
@@ -2138,7 +2142,6 @@
         </w:rPr>
         <w:t>(</w:t>
       </w:r>
-      <w:proofErr w:type="gramEnd"/>
       <w:r>
         <w:rPr>
           <w:rFonts w:ascii="Courier New" w:eastAsia="Times New Roman" w:hAnsi="Courier New" w:cs="Courier New"/>
@@ -2303,7 +2306,6 @@
         <w:t>(</w:t>
       </w:r>
       <w:proofErr w:type="spellStart"/>
-      <w:proofErr w:type="gramStart"/>
       <w:r>
         <w:rPr>
           <w:rFonts w:ascii="Courier New" w:eastAsia="Times New Roman" w:hAnsi="Courier New" w:cs="Courier New"/>
@@ -2326,7 +2328,6 @@
         <w:t>(</w:t>
       </w:r>
       <w:proofErr w:type="spellStart"/>
-      <w:proofErr w:type="gramEnd"/>
       <w:r>
         <w:rPr>
           <w:rFonts w:ascii="Courier New" w:eastAsia="Times New Roman" w:hAnsi="Courier New" w:cs="Courier New"/>
@@ -2476,39 +2477,17 @@
           <w:szCs w:val="20"/>
           <w:lang w:eastAsia="es-ES"/>
         </w:rPr>
-        <w:t>60777.</w:t>
-      </w:r>
-      <w:proofErr w:type="gramStart"/>
+        <w:t>60777.0423726854</w:t>
+      </w:r>
       <w:r>
         <w:rPr>
           <w:rFonts w:ascii="Courier New" w:eastAsia="Times New Roman" w:hAnsi="Courier New" w:cs="Courier New"/>
-          <w:color w:val="2AACB8"/>
+          <w:color w:val="BCBEC4"/>
           <w:sz w:val="20"/>
           <w:szCs w:val="20"/>
           <w:lang w:eastAsia="es-ES"/>
         </w:rPr>
-        <w:t>0423726854</w:t>
-      </w:r>
-      <w:r>
-        <w:rPr>
-          <w:rFonts w:ascii="Courier New" w:eastAsia="Times New Roman" w:hAnsi="Courier New" w:cs="Courier New"/>
-          <w:color w:val="BCBEC4"/>
-          <w:sz w:val="20"/>
-          <w:szCs w:val="20"/>
-          <w:lang w:eastAsia="es-ES"/>
-        </w:rPr>
-        <w:t>)&lt;</w:t>
-      </w:r>
-      <w:proofErr w:type="gramEnd"/>
-      <w:r>
-        <w:rPr>
-          <w:rFonts w:ascii="Courier New" w:eastAsia="Times New Roman" w:hAnsi="Courier New" w:cs="Courier New"/>
-          <w:color w:val="BCBEC4"/>
-          <w:sz w:val="20"/>
-          <w:szCs w:val="20"/>
-          <w:lang w:eastAsia="es-ES"/>
-        </w:rPr>
-        <w:t>TOL2_);</w:t>
+        <w:t>)&lt;TOL2_);</w:t>
       </w:r>
       <w:r>
         <w:rPr>
@@ -2793,14 +2772,12 @@
         </w:rPr>
         <w:t xml:space="preserve">Matrix </w:t>
       </w:r>
-      <w:proofErr w:type="gramStart"/>
       <w:r>
         <w:rPr>
           <w:color w:val="BCBEC4"/>
         </w:rPr>
         <w:t>sol(</w:t>
       </w:r>
-      <w:proofErr w:type="gramEnd"/>
       <w:r>
         <w:rPr>
           <w:color w:val="2AACB8"/>
@@ -2917,22 +2894,14 @@
         <w:rPr>
           <w:color w:val="BCBEC4"/>
         </w:rPr>
+        <w:t>(sol</w:t>
+      </w:r>
+      <w:r>
+        <w:rPr>
+          <w:color w:val="5F8C8A"/>
+        </w:rPr>
         <w:t>(</w:t>
       </w:r>
-      <w:proofErr w:type="gramStart"/>
-      <w:r>
-        <w:rPr>
-          <w:color w:val="BCBEC4"/>
-        </w:rPr>
-        <w:t>sol</w:t>
-      </w:r>
-      <w:r>
-        <w:rPr>
-          <w:color w:val="5F8C8A"/>
-        </w:rPr>
-        <w:t>(</w:t>
-      </w:r>
-      <w:proofErr w:type="gramEnd"/>
       <w:r>
         <w:rPr>
           <w:color w:val="2AACB8"/>
@@ -2994,22 +2963,64 @@
         <w:rPr>
           <w:color w:val="BCBEC4"/>
         </w:rPr>
+        <w:t>(sol</w:t>
+      </w:r>
+      <w:r>
+        <w:rPr>
+          <w:color w:val="5F8C8A"/>
+        </w:rPr>
         <w:t>(</w:t>
       </w:r>
-      <w:proofErr w:type="gramStart"/>
-      <w:r>
-        <w:rPr>
-          <w:color w:val="BCBEC4"/>
-        </w:rPr>
-        <w:t>sol</w:t>
+      <w:r>
+        <w:rPr>
+          <w:color w:val="2AACB8"/>
+        </w:rPr>
+        <w:t>1</w:t>
+      </w:r>
+      <w:r>
+        <w:rPr>
+          <w:color w:val="BCBEC4"/>
+        </w:rPr>
+        <w:t>,</w:t>
+      </w:r>
+      <w:r>
+        <w:rPr>
+          <w:color w:val="2AACB8"/>
+        </w:rPr>
+        <w:t>2</w:t>
       </w:r>
       <w:r>
         <w:rPr>
           <w:color w:val="5F8C8A"/>
         </w:rPr>
+        <w:t>)</w:t>
+      </w:r>
+      <w:r>
+        <w:rPr>
+          <w:color w:val="BCBEC4"/>
+        </w:rPr>
+        <w:t xml:space="preserve">) &lt; TOL_ &amp;&amp; </w:t>
+      </w:r>
+      <w:proofErr w:type="spellStart"/>
+      <w:r>
+        <w:rPr>
+          <w:color w:val="BCBEC4"/>
+        </w:rPr>
+        <w:t>fabs</w:t>
+      </w:r>
+      <w:proofErr w:type="spellEnd"/>
+      <w:r>
+        <w:rPr>
+          <w:color w:val="BCBEC4"/>
+        </w:rPr>
+        <w:t>(sol</w:t>
+      </w:r>
+      <w:r>
+        <w:rPr>
+          <w:color w:val="5F8C8A"/>
+        </w:rPr>
         <w:t>(</w:t>
       </w:r>
-      <w:proofErr w:type="gramEnd"/>
       <w:r>
         <w:rPr>
           <w:color w:val="2AACB8"/>
@@ -3026,7 +3037,7 @@
         <w:rPr>
           <w:color w:val="2AACB8"/>
         </w:rPr>
-        <w:t>2</w:t>
+        <w:t>3</w:t>
       </w:r>
       <w:r>
         <w:rPr>
@@ -3038,65 +3049,7 @@
         <w:rPr>
           <w:color w:val="BCBEC4"/>
         </w:rPr>
-        <w:t xml:space="preserve">) &lt; TOL_ &amp;&amp; </w:t>
-      </w:r>
-      <w:proofErr w:type="spellStart"/>
-      <w:r>
-        <w:rPr>
-          <w:color w:val="BCBEC4"/>
-        </w:rPr>
-        <w:t>fabs</w:t>
-      </w:r>
-      <w:proofErr w:type="spellEnd"/>
-      <w:r>
-        <w:rPr>
-          <w:color w:val="BCBEC4"/>
-        </w:rPr>
-        <w:t>(sol</w:t>
-      </w:r>
-      <w:r>
-        <w:rPr>
-          <w:color w:val="5F8C8A"/>
-        </w:rPr>
-        <w:t>(</w:t>
-      </w:r>
-      <w:r>
-        <w:rPr>
-          <w:color w:val="2AACB8"/>
-        </w:rPr>
-        <w:t>1</w:t>
-      </w:r>
-      <w:r>
-        <w:rPr>
-          <w:color w:val="BCBEC4"/>
-        </w:rPr>
-        <w:t>,</w:t>
-      </w:r>
-      <w:proofErr w:type="gramStart"/>
-      <w:r>
-        <w:rPr>
-          <w:color w:val="2AACB8"/>
-        </w:rPr>
-        <w:t>3</w:t>
-      </w:r>
-      <w:r>
-        <w:rPr>
-          <w:color w:val="5F8C8A"/>
-        </w:rPr>
-        <w:t>)</w:t>
-      </w:r>
-      <w:r>
-        <w:rPr>
-          <w:color w:val="BCBEC4"/>
-        </w:rPr>
-        <w:t>&lt;</w:t>
-      </w:r>
-      <w:proofErr w:type="gramEnd"/>
-      <w:r>
-        <w:rPr>
-          <w:color w:val="BCBEC4"/>
-        </w:rPr>
-        <w:t>TOL_)));</w:t>
+        <w:t>&lt;TOL_)));</w:t>
       </w:r>
       <w:r>
         <w:rPr>
@@ -3123,22 +3076,64 @@
         <w:rPr>
           <w:color w:val="BCBEC4"/>
         </w:rPr>
+        <w:t>(sol</w:t>
+      </w:r>
+      <w:r>
+        <w:rPr>
+          <w:color w:val="5F8C8A"/>
+        </w:rPr>
         <w:t>(</w:t>
       </w:r>
-      <w:proofErr w:type="gramStart"/>
-      <w:r>
-        <w:rPr>
-          <w:color w:val="BCBEC4"/>
-        </w:rPr>
-        <w:t>sol</w:t>
+      <w:r>
+        <w:rPr>
+          <w:color w:val="2AACB8"/>
+        </w:rPr>
+        <w:t>2</w:t>
+      </w:r>
+      <w:r>
+        <w:rPr>
+          <w:color w:val="BCBEC4"/>
+        </w:rPr>
+        <w:t>,</w:t>
+      </w:r>
+      <w:r>
+        <w:rPr>
+          <w:color w:val="2AACB8"/>
+        </w:rPr>
+        <w:t>1</w:t>
       </w:r>
       <w:r>
         <w:rPr>
           <w:color w:val="5F8C8A"/>
         </w:rPr>
+        <w:t>)</w:t>
+      </w:r>
+      <w:r>
+        <w:rPr>
+          <w:color w:val="BCBEC4"/>
+        </w:rPr>
+        <w:t xml:space="preserve">&lt;TOL_ &amp;&amp; </w:t>
+      </w:r>
+      <w:proofErr w:type="spellStart"/>
+      <w:r>
+        <w:rPr>
+          <w:color w:val="BCBEC4"/>
+        </w:rPr>
+        <w:t>fabs</w:t>
+      </w:r>
+      <w:proofErr w:type="spellEnd"/>
+      <w:r>
+        <w:rPr>
+          <w:color w:val="BCBEC4"/>
+        </w:rPr>
+        <w:t>(sol</w:t>
+      </w:r>
+      <w:r>
+        <w:rPr>
+          <w:color w:val="5F8C8A"/>
+        </w:rPr>
         <w:t>(</w:t>
       </w:r>
-      <w:proofErr w:type="gramEnd"/>
       <w:r>
         <w:rPr>
           <w:color w:val="2AACB8"/>
@@ -3151,12 +3146,11 @@
         </w:rPr>
         <w:t>,</w:t>
       </w:r>
-      <w:proofErr w:type="gramStart"/>
-      <w:r>
-        <w:rPr>
-          <w:color w:val="2AACB8"/>
-        </w:rPr>
-        <w:t>1</w:t>
+      <w:r>
+        <w:rPr>
+          <w:color w:val="2AACB8"/>
+        </w:rPr>
+        <w:t>2</w:t>
       </w:r>
       <w:r>
         <w:rPr>
@@ -3168,14 +3162,19 @@
         <w:rPr>
           <w:color w:val="BCBEC4"/>
         </w:rPr>
-        <w:t>&lt;</w:t>
-      </w:r>
-      <w:proofErr w:type="gramEnd"/>
-      <w:r>
-        <w:rPr>
-          <w:color w:val="BCBEC4"/>
-        </w:rPr>
-        <w:t xml:space="preserve">TOL_ &amp;&amp; </w:t>
+        <w:t>-</w:t>
+      </w:r>
+      <w:r>
+        <w:rPr>
+          <w:color w:val="2AACB8"/>
+        </w:rPr>
+        <w:t>0.54030230586814</w:t>
+      </w:r>
+      <w:r>
+        <w:rPr>
+          <w:color w:val="BCBEC4"/>
+        </w:rPr>
+        <w:t xml:space="preserve">) &lt; TOL_ &amp;&amp; </w:t>
       </w:r>
       <w:proofErr w:type="spellStart"/>
       <w:r>
@@ -3189,92 +3188,14 @@
         <w:rPr>
           <w:color w:val="BCBEC4"/>
         </w:rPr>
+        <w:t>(sol</w:t>
+      </w:r>
+      <w:r>
+        <w:rPr>
+          <w:color w:val="5F8C8A"/>
+        </w:rPr>
         <w:t>(</w:t>
       </w:r>
-      <w:proofErr w:type="gramStart"/>
-      <w:r>
-        <w:rPr>
-          <w:color w:val="BCBEC4"/>
-        </w:rPr>
-        <w:t>sol</w:t>
-      </w:r>
-      <w:r>
-        <w:rPr>
-          <w:color w:val="5F8C8A"/>
-        </w:rPr>
-        <w:t>(</w:t>
-      </w:r>
-      <w:proofErr w:type="gramEnd"/>
-      <w:r>
-        <w:rPr>
-          <w:color w:val="2AACB8"/>
-        </w:rPr>
-        <w:t>2</w:t>
-      </w:r>
-      <w:r>
-        <w:rPr>
-          <w:color w:val="BCBEC4"/>
-        </w:rPr>
-        <w:t>,</w:t>
-      </w:r>
-      <w:r>
-        <w:rPr>
-          <w:color w:val="2AACB8"/>
-        </w:rPr>
-        <w:t>2</w:t>
-      </w:r>
-      <w:r>
-        <w:rPr>
-          <w:color w:val="5F8C8A"/>
-        </w:rPr>
-        <w:t>)</w:t>
-      </w:r>
-      <w:r>
-        <w:rPr>
-          <w:color w:val="BCBEC4"/>
-        </w:rPr>
-        <w:t>-</w:t>
-      </w:r>
-      <w:r>
-        <w:rPr>
-          <w:color w:val="2AACB8"/>
-        </w:rPr>
-        <w:t>0.54030230586814</w:t>
-      </w:r>
-      <w:r>
-        <w:rPr>
-          <w:color w:val="BCBEC4"/>
-        </w:rPr>
-        <w:t xml:space="preserve">) &lt; TOL_ &amp;&amp; </w:t>
-      </w:r>
-      <w:proofErr w:type="spellStart"/>
-      <w:r>
-        <w:rPr>
-          <w:color w:val="BCBEC4"/>
-        </w:rPr>
-        <w:t>fabs</w:t>
-      </w:r>
-      <w:proofErr w:type="spellEnd"/>
-      <w:r>
-        <w:rPr>
-          <w:color w:val="BCBEC4"/>
-        </w:rPr>
-        <w:t>(</w:t>
-      </w:r>
-      <w:proofErr w:type="gramStart"/>
-      <w:r>
-        <w:rPr>
-          <w:color w:val="BCBEC4"/>
-        </w:rPr>
-        <w:t>sol</w:t>
-      </w:r>
-      <w:r>
-        <w:rPr>
-          <w:color w:val="5F8C8A"/>
-        </w:rPr>
-        <w:t>(</w:t>
-      </w:r>
-      <w:proofErr w:type="gramEnd"/>
       <w:r>
         <w:rPr>
           <w:color w:val="2AACB8"/>
@@ -3363,22 +3284,14 @@
         <w:rPr>
           <w:color w:val="BCBEC4"/>
         </w:rPr>
+        <w:t>(sol</w:t>
+      </w:r>
+      <w:r>
+        <w:rPr>
+          <w:color w:val="5F8C8A"/>
+        </w:rPr>
         <w:t>(</w:t>
       </w:r>
-      <w:proofErr w:type="gramStart"/>
-      <w:r>
-        <w:rPr>
-          <w:color w:val="BCBEC4"/>
-        </w:rPr>
-        <w:t>sol</w:t>
-      </w:r>
-      <w:r>
-        <w:rPr>
-          <w:color w:val="5F8C8A"/>
-        </w:rPr>
-        <w:t>(</w:t>
-      </w:r>
-      <w:proofErr w:type="gramEnd"/>
       <w:r>
         <w:rPr>
           <w:color w:val="2AACB8"/>
@@ -9784,6 +9697,73 @@
           <w:szCs w:val="32"/>
         </w:rPr>
         <w:t>:</w:t>
+      </w:r>
+    </w:p>
+    <w:p>
+      <w:pPr>
+        <w:kinsoku w:val="0"/>
+        <w:overflowPunct w:val="0"/>
+        <w:rPr>
+          <w:color w:val="FF0000"/>
+          <w:sz w:val="32"/>
+          <w:szCs w:val="32"/>
+        </w:rPr>
+      </w:pPr>
+      <w:proofErr w:type="spellStart"/>
+      <w:r>
+        <w:rPr>
+          <w:color w:val="FF0000"/>
+          <w:sz w:val="32"/>
+          <w:szCs w:val="32"/>
+        </w:rPr>
+        <w:t>AccelPointMass</w:t>
+      </w:r>
+      <w:proofErr w:type="spellEnd"/>
+      <w:r>
+        <w:rPr>
+          <w:color w:val="FF0000"/>
+          <w:sz w:val="32"/>
+          <w:szCs w:val="32"/>
+        </w:rPr>
+        <w:t>:</w:t>
+      </w:r>
+    </w:p>
+    <w:p>
+      <w:pPr>
+        <w:kinsoku w:val="0"/>
+        <w:overflowPunct w:val="0"/>
+        <w:rPr>
+          <w:color w:val="FF0000"/>
+          <w:sz w:val="32"/>
+          <w:szCs w:val="32"/>
+        </w:rPr>
+      </w:pPr>
+      <w:r>
+        <w:rPr>
+          <w:color w:val="FF0000"/>
+          <w:sz w:val="32"/>
+          <w:szCs w:val="32"/>
+        </w:rPr>
+        <w:t>IERS: (mencionar cambio de orden de los parámetros por manejo de valores por defecto)</w:t>
+      </w:r>
+    </w:p>
+    <w:p>
+      <w:pPr>
+        <w:kinsoku w:val="0"/>
+        <w:overflowPunct w:val="0"/>
+        <w:rPr>
+          <w:color w:val="FF0000"/>
+          <w:sz w:val="32"/>
+          <w:szCs w:val="32"/>
+        </w:rPr>
+      </w:pPr>
+      <w:r>
+        <w:rPr>
+          <w:color w:val="FF0000"/>
+          <w:sz w:val="32"/>
+          <w:szCs w:val="32"/>
+        </w:rPr>
+        <w:t>MeanObliquity:</w:t>
       </w:r>
     </w:p>
     <w:p>
@@ -9828,7 +9808,7 @@
 </file>
 
 <file path=word/numbering.xml><?xml version="1.0" encoding="utf-8"?>
-<w:numbering xmlns:wpc="http://schemas.microsoft.com/office/word/2010/wordprocessingCanvas" xmlns:cx="http://schemas.microsoft.com/office/drawing/2014/chartex" xmlns:cx1="http://schemas.microsoft.com/office/drawing/2015/9/8/chartex" xmlns:cx2="http://schemas.microsoft.com/office/drawing/2015/10/21/chartex" xmlns:cx3="http://schemas.microsoft.com/office/drawing/2016/5/9/chartex" xmlns:cx4="http://schemas.microsoft.com/office/drawing/2016/5/10/chartex" xmlns:cx5="http://schemas.microsoft.com/office/drawing/2016/5/11/chartex" xmlns:cx6="http://schemas.microsoft.com/office/drawing/2016/5/12/chartex" xmlns:cx7="http://schemas.microsoft.com/office/drawing/2016/5/13/chartex" xmlns:cx8="http://schemas.microsoft.com/office/drawing/2016/5/14/chartex" xmlns:mc="http://schemas.openxmlformats.org/markup-compatibility/2006" xmlns:aink="http://schemas.microsoft.com/office/drawing/2016/ink" xmlns:am3d="http://schemas.microsoft.com/office/drawing/2017/model3d" xmlns:o="urn:schemas-microsoft-com:office:office" xmlns:oel="http://schemas.microsoft.com/office/2019/extlst" xmlns:r="http://schemas.openxmlformats.org/officeDocument/2006/relationships" xmlns:m="http://schemas.openxmlformats.org/officeDocument/2006/math" xmlns:v="urn:schemas-microsoft-com:vml" xmlns:wp14="http://schemas.microsoft.com/office/word/2010/wordprocessingDrawing" xmlns:wp="http://schemas.openxmlformats.org/drawingml/2006/wordprocessingDrawing" xmlns:w10="urn:schemas-microsoft-com:office:word" xmlns:w="http://schemas.openxmlformats.org/wordprocessingml/2006/main" xmlns:w14="http://schemas.microsoft.com/office/word/2010/wordml" xmlns:w15="http://schemas.microsoft.com/office/word/2012/wordml" xmlns:w16cex="http://schemas.microsoft.com/office/word/2018/wordml/cex" xmlns:w16cid="http://schemas.microsoft.com/office/word/2016/wordml/cid" xmlns:w16="http://schemas.microsoft.com/office/word/2018/wordml" xmlns:w16du="http://schemas.microsoft.com/office/word/2023/wordml/word16du" xmlns:w16sdtdh="http://schemas.microsoft.com/office/word/2020/wordml/sdtdatahash" xmlns:w16sdtfl="http://schemas.microsoft.com/office/word/2024/wordml/sdtformatlock" xmlns:w16se="http://schemas.microsoft.com/office/word/2015/wordml/symex" xmlns:wpg="http://schemas.microsoft.com/office/word/2010/wordprocessingGroup" xmlns:wpi="http://schemas.microsoft.com/office/word/2010/wordprocessingInk" xmlns:wne="http://schemas.microsoft.com/office/word/2006/wordml" xmlns:wps="http://schemas.microsoft.com/office/word/2010/wordprocessingShape" mc:Ignorable="w14 w15 w16se w16cid w16 w16cex w16sdtdh w16sdtfl w16du wp14">
+<w:numbering xmlns:wpc="http://schemas.microsoft.com/office/word/2010/wordprocessingCanvas" xmlns:cx="http://schemas.microsoft.com/office/drawing/2014/chartex" xmlns:cx1="http://schemas.microsoft.com/office/drawing/2015/9/8/chartex" xmlns:cx2="http://schemas.microsoft.com/office/drawing/2015/10/21/chartex" xmlns:cx3="http://schemas.microsoft.com/office/drawing/2016/5/9/chartex" xmlns:cx4="http://schemas.microsoft.com/office/drawing/2016/5/10/chartex" xmlns:cx5="http://schemas.microsoft.com/office/drawing/2016/5/11/chartex" xmlns:cx6="http://schemas.microsoft.com/office/drawing/2016/5/12/chartex" xmlns:cx7="http://schemas.microsoft.com/office/drawing/2016/5/13/chartex" xmlns:cx8="http://schemas.microsoft.com/office/drawing/2016/5/14/chartex" xmlns:mc="http://schemas.openxmlformats.org/markup-compatibility/2006" xmlns:aink="http://schemas.microsoft.com/office/drawing/2016/ink" xmlns:am3d="http://schemas.microsoft.com/office/drawing/2017/model3d" xmlns:o="urn:schemas-microsoft-com:office:office" xmlns:r="http://schemas.openxmlformats.org/officeDocument/2006/relationships" xmlns:m="http://schemas.openxmlformats.org/officeDocument/2006/math" xmlns:v="urn:schemas-microsoft-com:vml" xmlns:wp14="http://schemas.microsoft.com/office/word/2010/wordprocessingDrawing" xmlns:wp="http://schemas.openxmlformats.org/drawingml/2006/wordprocessingDrawing" xmlns:w10="urn:schemas-microsoft-com:office:word" xmlns:w="http://schemas.openxmlformats.org/wordprocessingml/2006/main" xmlns:w14="http://schemas.microsoft.com/office/word/2010/wordml" xmlns:w15="http://schemas.microsoft.com/office/word/2012/wordml" xmlns:w16cex="http://schemas.microsoft.com/office/word/2018/wordml/cex" xmlns:w16cid="http://schemas.microsoft.com/office/word/2016/wordml/cid" xmlns:w16="http://schemas.microsoft.com/office/word/2018/wordml" xmlns:w16sdtdh="http://schemas.microsoft.com/office/word/2020/wordml/sdtdatahash" xmlns:w16se="http://schemas.microsoft.com/office/word/2015/wordml/symex" xmlns:wpg="http://schemas.microsoft.com/office/word/2010/wordprocessingGroup" xmlns:wpi="http://schemas.microsoft.com/office/word/2010/wordprocessingInk" xmlns:wne="http://schemas.microsoft.com/office/word/2006/wordml" xmlns:wps="http://schemas.microsoft.com/office/word/2010/wordprocessingShape" mc:Ignorable="w14 w15 w16se w16cid w16 w16cex w16sdtdh wp14">
   <w:abstractNum w:abstractNumId="0" w15:restartNumberingAfterBreak="0">
     <w:nsid w:val="00E328FB"/>
     <w:multiLevelType w:val="multilevel"/>
@@ -16385,143 +16365,143 @@
       </w:rPr>
     </w:lvl>
   </w:abstractNum>
-  <w:num w:numId="1" w16cid:durableId="1859926426">
+  <w:num w:numId="1">
     <w:abstractNumId w:val="12"/>
   </w:num>
-  <w:num w:numId="2" w16cid:durableId="1227229445">
+  <w:num w:numId="2">
     <w:abstractNumId w:val="25"/>
   </w:num>
-  <w:num w:numId="3" w16cid:durableId="1375152694">
+  <w:num w:numId="3">
     <w:abstractNumId w:val="30"/>
   </w:num>
-  <w:num w:numId="4" w16cid:durableId="2002854129">
+  <w:num w:numId="4">
     <w:abstractNumId w:val="15"/>
   </w:num>
-  <w:num w:numId="5" w16cid:durableId="235819666">
+  <w:num w:numId="5">
     <w:abstractNumId w:val="13"/>
   </w:num>
-  <w:num w:numId="6" w16cid:durableId="1251230167">
+  <w:num w:numId="6">
     <w:abstractNumId w:val="16"/>
   </w:num>
-  <w:num w:numId="7" w16cid:durableId="841746997">
+  <w:num w:numId="7">
     <w:abstractNumId w:val="36"/>
   </w:num>
-  <w:num w:numId="8" w16cid:durableId="1035889774">
+  <w:num w:numId="8">
     <w:abstractNumId w:val="21"/>
   </w:num>
-  <w:num w:numId="9" w16cid:durableId="1484465462">
+  <w:num w:numId="9">
     <w:abstractNumId w:val="17"/>
   </w:num>
-  <w:num w:numId="10" w16cid:durableId="109783566">
+  <w:num w:numId="10">
     <w:abstractNumId w:val="2"/>
   </w:num>
-  <w:num w:numId="11" w16cid:durableId="645014407">
+  <w:num w:numId="11">
     <w:abstractNumId w:val="26"/>
   </w:num>
-  <w:num w:numId="12" w16cid:durableId="1520386179">
+  <w:num w:numId="12">
     <w:abstractNumId w:val="37"/>
   </w:num>
-  <w:num w:numId="13" w16cid:durableId="1348563273">
+  <w:num w:numId="13">
     <w:abstractNumId w:val="22"/>
   </w:num>
-  <w:num w:numId="14" w16cid:durableId="2050369940">
+  <w:num w:numId="14">
     <w:abstractNumId w:val="43"/>
   </w:num>
-  <w:num w:numId="15" w16cid:durableId="71398432">
+  <w:num w:numId="15">
     <w:abstractNumId w:val="8"/>
   </w:num>
-  <w:num w:numId="16" w16cid:durableId="2115202827">
+  <w:num w:numId="16">
     <w:abstractNumId w:val="5"/>
   </w:num>
-  <w:num w:numId="17" w16cid:durableId="1597324961">
+  <w:num w:numId="17">
     <w:abstractNumId w:val="35"/>
   </w:num>
-  <w:num w:numId="18" w16cid:durableId="308025923">
+  <w:num w:numId="18">
     <w:abstractNumId w:val="14"/>
   </w:num>
-  <w:num w:numId="19" w16cid:durableId="1802385435">
+  <w:num w:numId="19">
     <w:abstractNumId w:val="3"/>
   </w:num>
-  <w:num w:numId="20" w16cid:durableId="370421553">
+  <w:num w:numId="20">
     <w:abstractNumId w:val="40"/>
   </w:num>
-  <w:num w:numId="21" w16cid:durableId="175198399">
+  <w:num w:numId="21">
     <w:abstractNumId w:val="9"/>
   </w:num>
-  <w:num w:numId="22" w16cid:durableId="938222404">
+  <w:num w:numId="22">
     <w:abstractNumId w:val="29"/>
   </w:num>
-  <w:num w:numId="23" w16cid:durableId="556084598">
+  <w:num w:numId="23">
     <w:abstractNumId w:val="41"/>
   </w:num>
-  <w:num w:numId="24" w16cid:durableId="838161464">
+  <w:num w:numId="24">
     <w:abstractNumId w:val="34"/>
   </w:num>
-  <w:num w:numId="25" w16cid:durableId="1281032419">
+  <w:num w:numId="25">
     <w:abstractNumId w:val="38"/>
   </w:num>
-  <w:num w:numId="26" w16cid:durableId="2038655050">
+  <w:num w:numId="26">
     <w:abstractNumId w:val="0"/>
   </w:num>
-  <w:num w:numId="27" w16cid:durableId="610481172">
+  <w:num w:numId="27">
     <w:abstractNumId w:val="31"/>
   </w:num>
-  <w:num w:numId="28" w16cid:durableId="101070015">
+  <w:num w:numId="28">
     <w:abstractNumId w:val="11"/>
   </w:num>
-  <w:num w:numId="29" w16cid:durableId="1593081518">
+  <w:num w:numId="29">
     <w:abstractNumId w:val="4"/>
   </w:num>
-  <w:num w:numId="30" w16cid:durableId="544609466">
+  <w:num w:numId="30">
     <w:abstractNumId w:val="10"/>
   </w:num>
-  <w:num w:numId="31" w16cid:durableId="1415056233">
+  <w:num w:numId="31">
     <w:abstractNumId w:val="1"/>
   </w:num>
-  <w:num w:numId="32" w16cid:durableId="1311598575">
+  <w:num w:numId="32">
     <w:abstractNumId w:val="42"/>
   </w:num>
-  <w:num w:numId="33" w16cid:durableId="2089493654">
+  <w:num w:numId="33">
     <w:abstractNumId w:val="19"/>
   </w:num>
-  <w:num w:numId="34" w16cid:durableId="65346185">
+  <w:num w:numId="34">
     <w:abstractNumId w:val="28"/>
   </w:num>
-  <w:num w:numId="35" w16cid:durableId="368915048">
+  <w:num w:numId="35">
     <w:abstractNumId w:val="18"/>
   </w:num>
-  <w:num w:numId="36" w16cid:durableId="2046633286">
+  <w:num w:numId="36">
     <w:abstractNumId w:val="33"/>
   </w:num>
-  <w:num w:numId="37" w16cid:durableId="1728649310">
+  <w:num w:numId="37">
     <w:abstractNumId w:val="6"/>
   </w:num>
-  <w:num w:numId="38" w16cid:durableId="215744628">
+  <w:num w:numId="38">
     <w:abstractNumId w:val="20"/>
   </w:num>
-  <w:num w:numId="39" w16cid:durableId="940992256">
+  <w:num w:numId="39">
     <w:abstractNumId w:val="27"/>
   </w:num>
-  <w:num w:numId="40" w16cid:durableId="1258751959">
+  <w:num w:numId="40">
     <w:abstractNumId w:val="7"/>
   </w:num>
-  <w:num w:numId="41" w16cid:durableId="119538166">
+  <w:num w:numId="41">
     <w:abstractNumId w:val="23"/>
   </w:num>
-  <w:num w:numId="42" w16cid:durableId="2098011997">
+  <w:num w:numId="42">
     <w:abstractNumId w:val="24"/>
   </w:num>
-  <w:num w:numId="43" w16cid:durableId="1665160950">
+  <w:num w:numId="43">
     <w:abstractNumId w:val="39"/>
   </w:num>
-  <w:num w:numId="44" w16cid:durableId="1193110178">
+  <w:num w:numId="44">
     <w:abstractNumId w:val="32"/>
   </w:num>
 </w:numbering>
 </file>
 
 <file path=word/styles.xml><?xml version="1.0" encoding="utf-8"?>
-<w:styles xmlns:mc="http://schemas.openxmlformats.org/markup-compatibility/2006" xmlns:r="http://schemas.openxmlformats.org/officeDocument/2006/relationships" xmlns:w="http://schemas.openxmlformats.org/wordprocessingml/2006/main" xmlns:w14="http://schemas.microsoft.com/office/word/2010/wordml" xmlns:w15="http://schemas.microsoft.com/office/word/2012/wordml" xmlns:w16cex="http://schemas.microsoft.com/office/word/2018/wordml/cex" xmlns:w16cid="http://schemas.microsoft.com/office/word/2016/wordml/cid" xmlns:w16="http://schemas.microsoft.com/office/word/2018/wordml" xmlns:w16du="http://schemas.microsoft.com/office/word/2023/wordml/word16du" xmlns:w16sdtdh="http://schemas.microsoft.com/office/word/2020/wordml/sdtdatahash" xmlns:w16sdtfl="http://schemas.microsoft.com/office/word/2024/wordml/sdtformatlock" xmlns:w16se="http://schemas.microsoft.com/office/word/2015/wordml/symex" mc:Ignorable="w14 w15 w16se w16cid w16 w16cex w16sdtdh w16sdtfl w16du">
+<w:styles xmlns:mc="http://schemas.openxmlformats.org/markup-compatibility/2006" xmlns:r="http://schemas.openxmlformats.org/officeDocument/2006/relationships" xmlns:w="http://schemas.openxmlformats.org/wordprocessingml/2006/main" xmlns:w14="http://schemas.microsoft.com/office/word/2010/wordml" xmlns:w15="http://schemas.microsoft.com/office/word/2012/wordml" xmlns:w16cex="http://schemas.microsoft.com/office/word/2018/wordml/cex" xmlns:w16cid="http://schemas.microsoft.com/office/word/2016/wordml/cid" xmlns:w16="http://schemas.microsoft.com/office/word/2018/wordml" xmlns:w16sdtdh="http://schemas.microsoft.com/office/word/2020/wordml/sdtdatahash" xmlns:w16se="http://schemas.microsoft.com/office/word/2015/wordml/symex" mc:Ignorable="w14 w15 w16se w16cid w16 w16cex w16sdtdh">
   <w:docDefaults>
     <w:rPrDefault>
       <w:rPr>

</xml_diff>

<commit_message>
gast gibbs y no se que mas
</commit_message>
<xml_diff>
--- a/Seguimiento.docx
+++ b/Seguimiento.docx
@@ -470,6 +470,7 @@
         <w:textAlignment w:val="baseline"/>
         <w:rPr>
           <w:rFonts w:ascii="Arial" w:hAnsi="Arial"/>
+          <w:highlight w:val="green"/>
         </w:rPr>
       </w:pPr>
       <w:proofErr w:type="spellStart"/>
@@ -477,6 +478,7 @@
         <w:rPr>
           <w:rStyle w:val="normaltextrun"/>
           <w:rFonts w:ascii="Arial" w:hAnsi="Arial"/>
+          <w:highlight w:val="green"/>
         </w:rPr>
         <w:t>elements.m</w:t>
       </w:r>
@@ -485,6 +487,7 @@
         <w:rPr>
           <w:rStyle w:val="eop"/>
           <w:rFonts w:ascii="Arial" w:hAnsi="Arial"/>
+          <w:highlight w:val="green"/>
         </w:rPr>
         <w:t> </w:t>
       </w:r>
@@ -500,6 +503,7 @@
         <w:textAlignment w:val="baseline"/>
         <w:rPr>
           <w:rFonts w:ascii="Arial" w:hAnsi="Arial"/>
+          <w:highlight w:val="green"/>
         </w:rPr>
       </w:pPr>
       <w:proofErr w:type="spellStart"/>
@@ -507,6 +511,7 @@
         <w:rPr>
           <w:rStyle w:val="normaltextrun"/>
           <w:rFonts w:ascii="Arial" w:hAnsi="Arial"/>
+          <w:highlight w:val="green"/>
         </w:rPr>
         <w:t>EqnEquinox.m</w:t>
       </w:r>
@@ -515,6 +520,7 @@
         <w:rPr>
           <w:rStyle w:val="eop"/>
           <w:rFonts w:ascii="Arial" w:hAnsi="Arial"/>
+          <w:highlight w:val="green"/>
         </w:rPr>
         <w:t> </w:t>
       </w:r>
@@ -566,6 +572,7 @@
         <w:textAlignment w:val="baseline"/>
         <w:rPr>
           <w:rFonts w:ascii="Arial" w:hAnsi="Arial"/>
+          <w:highlight w:val="green"/>
         </w:rPr>
       </w:pPr>
       <w:proofErr w:type="spellStart"/>
@@ -573,6 +580,7 @@
         <w:rPr>
           <w:rStyle w:val="normaltextrun"/>
           <w:rFonts w:ascii="Arial" w:hAnsi="Arial"/>
+          <w:highlight w:val="green"/>
         </w:rPr>
         <w:t>gast.m</w:t>
       </w:r>
@@ -581,6 +589,7 @@
         <w:rPr>
           <w:rStyle w:val="eop"/>
           <w:rFonts w:ascii="Arial" w:hAnsi="Arial"/>
+          <w:highlight w:val="green"/>
         </w:rPr>
         <w:t> </w:t>
       </w:r>
@@ -689,6 +698,7 @@
         <w:textAlignment w:val="baseline"/>
         <w:rPr>
           <w:rFonts w:ascii="Arial" w:hAnsi="Arial"/>
+          <w:highlight w:val="green"/>
         </w:rPr>
       </w:pPr>
       <w:proofErr w:type="spellStart"/>
@@ -696,6 +706,7 @@
         <w:rPr>
           <w:rStyle w:val="normaltextrun"/>
           <w:rFonts w:ascii="Arial" w:hAnsi="Arial"/>
+          <w:highlight w:val="green"/>
         </w:rPr>
         <w:t>gmst.m</w:t>
       </w:r>
@@ -704,6 +715,7 @@
         <w:rPr>
           <w:rStyle w:val="eop"/>
           <w:rFonts w:ascii="Arial" w:hAnsi="Arial"/>
+          <w:highlight w:val="green"/>
         </w:rPr>
         <w:t> </w:t>
       </w:r>
@@ -44883,43 +44895,32 @@
     </w:p>
     <w:p>
       <w:pPr>
-        <w:rPr>
-          <w:color w:val="000000" w:themeColor="text1"/>
+        <w:kinsoku w:val="0"/>
+        <w:overflowPunct w:val="0"/>
+        <w:rPr>
+          <w:color w:val="FF0000"/>
+          <w:sz w:val="32"/>
+          <w:szCs w:val="32"/>
         </w:rPr>
       </w:pPr>
-      <w:r>
-        <w:rPr>
-          <w:color w:val="000000" w:themeColor="text1"/>
-        </w:rPr>
-        <w:t xml:space="preserve">La implementación de </w:t>
-      </w:r>
-      <w:proofErr w:type="spellStart"/>
-      <w:r>
-        <w:rPr>
-          <w:color w:val="000000" w:themeColor="text1"/>
-        </w:rPr>
+      <w:proofErr w:type="spellStart"/>
+      <w:r>
+        <w:rPr>
+          <w:color w:val="FF0000"/>
+          <w:sz w:val="32"/>
+          <w:szCs w:val="32"/>
+        </w:rPr>
+        <w:lastRenderedPageBreak/>
         <w:t>AzElPa</w:t>
       </w:r>
       <w:proofErr w:type="spellEnd"/>
       <w:r>
         <w:rPr>
-          <w:color w:val="000000" w:themeColor="text1"/>
-        </w:rPr>
-        <w:t xml:space="preserve"> no tuvo ninguna dificultad, </w:t>
-      </w:r>
-      <w:proofErr w:type="spellStart"/>
-      <w:r>
-        <w:rPr>
-          <w:color w:val="000000" w:themeColor="text1"/>
-        </w:rPr>
-        <w:t>tests</w:t>
-      </w:r>
-      <w:proofErr w:type="spellEnd"/>
-      <w:r>
-        <w:rPr>
-          <w:color w:val="000000" w:themeColor="text1"/>
-        </w:rPr>
-        <w:t xml:space="preserve"> unitarios creados:</w:t>
+          <w:color w:val="FF0000"/>
+          <w:sz w:val="32"/>
+          <w:szCs w:val="32"/>
+        </w:rPr>
+        <w:t>:</w:t>
       </w:r>
     </w:p>
     <w:p>
@@ -44932,7 +44933,47 @@
         <w:rPr>
           <w:color w:val="000000" w:themeColor="text1"/>
         </w:rPr>
-        <w:lastRenderedPageBreak/>
+        <w:t xml:space="preserve">La implementación de </w:t>
+      </w:r>
+      <w:proofErr w:type="spellStart"/>
+      <w:r>
+        <w:rPr>
+          <w:color w:val="000000" w:themeColor="text1"/>
+        </w:rPr>
+        <w:t>AzElPa</w:t>
+      </w:r>
+      <w:proofErr w:type="spellEnd"/>
+      <w:r>
+        <w:rPr>
+          <w:color w:val="000000" w:themeColor="text1"/>
+        </w:rPr>
+        <w:t xml:space="preserve"> no tuvo ninguna dificultad, </w:t>
+      </w:r>
+      <w:proofErr w:type="spellStart"/>
+      <w:r>
+        <w:rPr>
+          <w:color w:val="000000" w:themeColor="text1"/>
+        </w:rPr>
+        <w:t>tests</w:t>
+      </w:r>
+      <w:proofErr w:type="spellEnd"/>
+      <w:r>
+        <w:rPr>
+          <w:color w:val="000000" w:themeColor="text1"/>
+        </w:rPr>
+        <w:t xml:space="preserve"> unitarios creados:</w:t>
+      </w:r>
+    </w:p>
+    <w:p>
+      <w:pPr>
+        <w:rPr>
+          <w:color w:val="000000" w:themeColor="text1"/>
+        </w:rPr>
+      </w:pPr>
+      <w:r>
+        <w:rPr>
+          <w:color w:val="000000" w:themeColor="text1"/>
+        </w:rPr>
         <w:t>Test unitarios creados:</w:t>
       </w:r>
     </w:p>
@@ -46597,6 +46638,12 @@
           <w:color w:val="BCBEC4"/>
         </w:rPr>
         <w:br/>
+      </w:r>
+      <w:r>
+        <w:rPr>
+          <w:color w:val="BCBEC4"/>
+        </w:rPr>
+        <w:lastRenderedPageBreak/>
         <w:t xml:space="preserve">    Phi-&gt;</w:t>
       </w:r>
       <w:proofErr w:type="spellStart"/>
@@ -46691,7 +46738,6 @@
         <w:rPr>
           <w:color w:val="BCBEC4"/>
         </w:rPr>
-        <w:lastRenderedPageBreak/>
         <w:br/>
         <w:t xml:space="preserve">    _</w:t>
       </w:r>
@@ -48859,6 +48905,12 @@
           <w:color w:val="BCBEC4"/>
         </w:rPr>
         <w:br/>
+      </w:r>
+      <w:r>
+        <w:rPr>
+          <w:color w:val="BCBEC4"/>
+        </w:rPr>
+        <w:lastRenderedPageBreak/>
         <w:t xml:space="preserve">            }</w:t>
       </w:r>
       <w:r>
@@ -48940,12 +48992,6 @@
           <w:color w:val="BCBEC4"/>
         </w:rPr>
         <w:br/>
-      </w:r>
-      <w:r>
-        <w:rPr>
-          <w:color w:val="BCBEC4"/>
-        </w:rPr>
-        <w:lastRenderedPageBreak/>
         <w:t xml:space="preserve">    }</w:t>
       </w:r>
       <w:r>
@@ -50602,6 +50648,12 @@
           <w:color w:val="7A7E85"/>
         </w:rPr>
         <w:br/>
+      </w:r>
+      <w:r>
+        <w:rPr>
+          <w:color w:val="7A7E85"/>
+        </w:rPr>
+        <w:lastRenderedPageBreak/>
         <w:t xml:space="preserve">    </w:t>
       </w:r>
       <w:r>
@@ -50829,7 +50881,6 @@
         <w:rPr>
           <w:color w:val="BCBEC4"/>
         </w:rPr>
-        <w:lastRenderedPageBreak/>
         <w:br/>
         <w:t xml:space="preserve">    </w:t>
       </w:r>
@@ -53298,6 +53349,12 @@
           <w:color w:val="BCBEC4"/>
         </w:rPr>
         <w:br/>
+      </w:r>
+      <w:r>
+        <w:rPr>
+          <w:color w:val="BCBEC4"/>
+        </w:rPr>
+        <w:lastRenderedPageBreak/>
         <w:t xml:space="preserve">    </w:t>
       </w:r>
       <w:proofErr w:type="spellStart"/>
@@ -53380,7 +53437,6 @@
         <w:rPr>
           <w:color w:val="000000" w:themeColor="text1"/>
         </w:rPr>
-        <w:lastRenderedPageBreak/>
         <w:t xml:space="preserve">La implementación de </w:t>
       </w:r>
       <w:proofErr w:type="spellStart"/>
@@ -57573,6 +57629,7 @@
           <w:sz w:val="32"/>
           <w:szCs w:val="32"/>
         </w:rPr>
+        <w:lastRenderedPageBreak/>
         <w:t>Timediff</w:t>
       </w:r>
       <w:proofErr w:type="spellEnd"/>
@@ -57665,7 +57722,6 @@
           <w:szCs w:val="20"/>
           <w:lang w:eastAsia="es-ES"/>
         </w:rPr>
-        <w:lastRenderedPageBreak/>
         <w:t>int</w:t>
       </w:r>
       <w:proofErr w:type="spellEnd"/>
@@ -58837,6 +58893,164 @@
         <w:br/>
         <w:t>}</w:t>
       </w:r>
+    </w:p>
+    <w:p>
+      <w:pPr>
+        <w:kinsoku w:val="0"/>
+        <w:overflowPunct w:val="0"/>
+        <w:rPr>
+          <w:color w:val="FF0000"/>
+          <w:sz w:val="32"/>
+          <w:szCs w:val="32"/>
+        </w:rPr>
+      </w:pPr>
+      <w:proofErr w:type="spellStart"/>
+      <w:r>
+        <w:rPr>
+          <w:color w:val="FF0000"/>
+          <w:sz w:val="32"/>
+          <w:szCs w:val="32"/>
+        </w:rPr>
+        <w:t>Elements</w:t>
+      </w:r>
+      <w:proofErr w:type="spellEnd"/>
+      <w:r>
+        <w:rPr>
+          <w:color w:val="FF0000"/>
+          <w:sz w:val="32"/>
+          <w:szCs w:val="32"/>
+        </w:rPr>
+        <w:t>:</w:t>
+      </w:r>
+    </w:p>
+    <w:p>
+      <w:pPr>
+        <w:kinsoku w:val="0"/>
+        <w:overflowPunct w:val="0"/>
+        <w:rPr>
+          <w:color w:val="FF0000"/>
+          <w:sz w:val="32"/>
+          <w:szCs w:val="32"/>
+        </w:rPr>
+      </w:pPr>
+      <w:proofErr w:type="spellStart"/>
+      <w:r>
+        <w:rPr>
+          <w:color w:val="FF0000"/>
+          <w:sz w:val="32"/>
+          <w:szCs w:val="32"/>
+        </w:rPr>
+        <w:t>EqnEquinox</w:t>
+      </w:r>
+      <w:proofErr w:type="spellEnd"/>
+      <w:r>
+        <w:rPr>
+          <w:color w:val="FF0000"/>
+          <w:sz w:val="32"/>
+          <w:szCs w:val="32"/>
+        </w:rPr>
+        <w:t>:</w:t>
+      </w:r>
+    </w:p>
+    <w:p>
+      <w:pPr>
+        <w:kinsoku w:val="0"/>
+        <w:overflowPunct w:val="0"/>
+        <w:rPr>
+          <w:color w:val="FF0000"/>
+          <w:sz w:val="32"/>
+          <w:szCs w:val="32"/>
+        </w:rPr>
+      </w:pPr>
+      <w:proofErr w:type="spellStart"/>
+      <w:r>
+        <w:rPr>
+          <w:color w:val="FF0000"/>
+          <w:sz w:val="32"/>
+          <w:szCs w:val="32"/>
+        </w:rPr>
+        <w:t>gmst</w:t>
+      </w:r>
+      <w:proofErr w:type="spellEnd"/>
+      <w:r>
+        <w:rPr>
+          <w:color w:val="FF0000"/>
+          <w:sz w:val="32"/>
+          <w:szCs w:val="32"/>
+        </w:rPr>
+        <w:t>:</w:t>
+      </w:r>
+    </w:p>
+    <w:p>
+      <w:pPr>
+        <w:kinsoku w:val="0"/>
+        <w:overflowPunct w:val="0"/>
+        <w:rPr>
+          <w:color w:val="FF0000"/>
+          <w:sz w:val="32"/>
+          <w:szCs w:val="32"/>
+        </w:rPr>
+      </w:pPr>
+      <w:r>
+        <w:rPr>
+          <w:color w:val="FF0000"/>
+          <w:sz w:val="32"/>
+          <w:szCs w:val="32"/>
+        </w:rPr>
+        <w:t>gast</w:t>
+      </w:r>
+      <w:r>
+        <w:rPr>
+          <w:color w:val="FF0000"/>
+          <w:sz w:val="32"/>
+          <w:szCs w:val="32"/>
+        </w:rPr>
+        <w:t>:</w:t>
+      </w:r>
+    </w:p>
+    <w:p>
+      <w:pPr>
+        <w:kinsoku w:val="0"/>
+        <w:overflowPunct w:val="0"/>
+        <w:rPr>
+          <w:color w:val="FF0000"/>
+          <w:sz w:val="32"/>
+          <w:szCs w:val="32"/>
+        </w:rPr>
+      </w:pPr>
+    </w:p>
+    <w:p>
+      <w:pPr>
+        <w:kinsoku w:val="0"/>
+        <w:overflowPunct w:val="0"/>
+        <w:rPr>
+          <w:color w:val="FF0000"/>
+          <w:sz w:val="32"/>
+          <w:szCs w:val="32"/>
+        </w:rPr>
+      </w:pPr>
+    </w:p>
+    <w:p>
+      <w:pPr>
+        <w:kinsoku w:val="0"/>
+        <w:overflowPunct w:val="0"/>
+        <w:rPr>
+          <w:color w:val="FF0000"/>
+          <w:sz w:val="32"/>
+          <w:szCs w:val="32"/>
+        </w:rPr>
+      </w:pPr>
+    </w:p>
+    <w:p>
+      <w:pPr>
+        <w:kinsoku w:val="0"/>
+        <w:overflowPunct w:val="0"/>
+        <w:rPr>
+          <w:color w:val="FF0000"/>
+          <w:sz w:val="32"/>
+          <w:szCs w:val="32"/>
+        </w:rPr>
+      </w:pPr>
     </w:p>
     <w:p>
       <w:pPr>

</xml_diff>